<commit_message>
test: migrate docx primitives/comparison suites to unified traceability
</commit_message>
<xml_diff>
--- a/packages/docx-comparison/src/testing/outputs/atomizer_redline.docx
+++ b/packages/docx-comparison/src/testing/outputs/atomizer_redline.docx
@@ -129,7 +129,7 @@
         </w:rPr>
         <w:t xml:space="preserve">The ILPA Model Limited Partnership Agreement </w:t>
       </w:r>
-      <w:del w:id="1" w:author="AtomizerTest" w:date="2026-02-20T03:04:20Z">
+      <w:del w:id="1" w:author="AtomizerTest" w:date="2026-02-21T02:16:04Z">
         <w:r>
           <w:rPr>
             <w:b/>
@@ -139,7 +139,7 @@
           <w:delText>(Whole-of-Fund</w:delText>
         </w:r>
       </w:del>
-      <w:ins w:id="2" w:author="AtomizerTest" w:date="2026-02-20T03:04:20Z">
+      <w:ins w:id="2" w:author="AtomizerTest" w:date="2026-02-21T02:16:04Z">
         <w:r>
           <w:rPr>
             <w:b/>
@@ -166,11 +166,11 @@
         <w:spacing w:after="240"/>
         <w:jc w:val="center"/>
         <w:rPr>
-          <w:del w:id="3" w:author="AtomizerTest" w:date="2026-02-20T03:04:20Z"/>
+          <w:del w:id="3" w:author="AtomizerTest" w:date="2026-02-21T02:16:04Z"/>
           <w:bCs/>
         </w:rPr>
       </w:pPr>
-      <w:del w:id="4" w:author="AtomizerTest" w:date="2026-02-20T03:04:20Z">
+      <w:del w:id="4" w:author="AtomizerTest" w:date="2026-02-21T02:16:04Z">
         <w:r>
           <w:rPr>
             <w:b/>
@@ -181,7 +181,7 @@
         </w:r>
       </w:del>
     </w:p>
-    <w:del w:id="5" w:author="AtomizerTest" w:date="2026-02-20T03:04:20Z">
+    <w:del w:id="5" w:author="AtomizerTest" w:date="2026-02-21T02:16:04Z">
       <w:p>
         <w:pPr>
           <w:autoSpaceDE w:val="0"/>
@@ -203,11 +203,11 @@
         <w:spacing w:after="240"/>
         <w:jc w:val="center"/>
         <w:rPr>
-          <w:ins w:id="6" w:author="AtomizerTest" w:date="2026-02-20T03:04:20Z"/>
+          <w:ins w:id="6" w:author="AtomizerTest" w:date="2026-02-21T02:16:04Z"/>
           <w:bCs/>
         </w:rPr>
       </w:pPr>
-      <w:ins w:id="7" w:author="AtomizerTest" w:date="2026-02-20T03:04:20Z">
+      <w:ins w:id="7" w:author="AtomizerTest" w:date="2026-02-21T02:16:04Z">
         <w:r>
           <w:rPr>
             <w:b/>
@@ -218,7 +218,7 @@
         </w:r>
       </w:ins>
     </w:p>
-    <w:ins w:id="8" w:author="AtomizerTest" w:date="2026-02-20T03:04:20Z">
+    <w:ins w:id="8" w:author="AtomizerTest" w:date="2026-02-21T02:16:04Z">
       <w:p>
         <w:pPr>
           <w:autoSpaceDE w:val="0"/>
@@ -770,7 +770,7 @@
         <w:instrText xml:space="preserve"> PAGEREF _Toc2094293 \h </w:instrText>
         <w:fldChar w:fldCharType="separate"/>
       </w:r>
-      <w:del w:id="9" w:author="AtomizerTest" w:date="2026-02-20T03:04:20Z">
+      <w:del w:id="9" w:author="AtomizerTest" w:date="2026-02-21T02:16:04Z">
         <w:r>
           <w:rPr>
             <w:noProof/>
@@ -779,7 +779,7 @@
           <w:fldChar w:fldCharType="end"/>
         </w:r>
       </w:del>
-      <w:ins w:id="10" w:author="AtomizerTest" w:date="2026-02-20T03:04:20Z">
+      <w:ins w:id="10" w:author="AtomizerTest" w:date="2026-02-21T02:16:04Z">
         <w:r>
           <w:rPr>
             <w:noProof/>
@@ -812,7 +812,7 @@
         <w:instrText xml:space="preserve"> PAGEREF _Toc2094294 \h </w:instrText>
         <w:fldChar w:fldCharType="separate"/>
       </w:r>
-      <w:del w:id="11" w:author="AtomizerTest" w:date="2026-02-20T03:04:20Z">
+      <w:del w:id="11" w:author="AtomizerTest" w:date="2026-02-21T02:16:04Z">
         <w:r>
           <w:rPr>
             <w:noProof/>
@@ -821,7 +821,7 @@
           <w:fldChar w:fldCharType="end"/>
         </w:r>
       </w:del>
-      <w:ins w:id="12" w:author="AtomizerTest" w:date="2026-02-20T03:04:20Z">
+      <w:ins w:id="12" w:author="AtomizerTest" w:date="2026-02-21T02:16:04Z">
         <w:r>
           <w:rPr>
             <w:noProof/>
@@ -854,7 +854,7 @@
         <w:instrText xml:space="preserve"> PAGEREF _Toc2094295 \h </w:instrText>
         <w:fldChar w:fldCharType="separate"/>
       </w:r>
-      <w:del w:id="13" w:author="AtomizerTest" w:date="2026-02-20T03:04:20Z">
+      <w:del w:id="13" w:author="AtomizerTest" w:date="2026-02-21T02:16:04Z">
         <w:r>
           <w:rPr>
             <w:noProof/>
@@ -863,7 +863,7 @@
           <w:fldChar w:fldCharType="end"/>
         </w:r>
       </w:del>
-      <w:ins w:id="14" w:author="AtomizerTest" w:date="2026-02-20T03:04:20Z">
+      <w:ins w:id="14" w:author="AtomizerTest" w:date="2026-02-21T02:16:04Z">
         <w:r>
           <w:rPr>
             <w:noProof/>
@@ -896,7 +896,7 @@
         <w:instrText xml:space="preserve"> PAGEREF _Toc2094296 \h </w:instrText>
         <w:fldChar w:fldCharType="separate"/>
       </w:r>
-      <w:del w:id="15" w:author="AtomizerTest" w:date="2026-02-20T03:04:20Z">
+      <w:del w:id="15" w:author="AtomizerTest" w:date="2026-02-21T02:16:04Z">
         <w:r>
           <w:rPr>
             <w:noProof/>
@@ -905,7 +905,7 @@
           <w:fldChar w:fldCharType="end"/>
         </w:r>
       </w:del>
-      <w:ins w:id="16" w:author="AtomizerTest" w:date="2026-02-20T03:04:20Z">
+      <w:ins w:id="16" w:author="AtomizerTest" w:date="2026-02-21T02:16:04Z">
         <w:r>
           <w:rPr>
             <w:noProof/>
@@ -936,7 +936,7 @@
         <w:tab/>
         <w:fldChar w:fldCharType="begin"/>
       </w:r>
-      <w:del w:id="17" w:author="AtomizerTest" w:date="2026-02-20T03:04:20Z">
+      <w:del w:id="17" w:author="AtomizerTest" w:date="2026-02-21T02:16:04Z">
         <w:r>
           <w:rPr>
             <w:noProof/>
@@ -947,7 +947,7 @@
           <w:fldChar w:fldCharType="end"/>
         </w:r>
       </w:del>
-      <w:ins w:id="18" w:author="AtomizerTest" w:date="2026-02-20T03:04:20Z">
+      <w:ins w:id="18" w:author="AtomizerTest" w:date="2026-02-21T02:16:04Z">
         <w:r>
           <w:rPr>
             <w:noProof/>
@@ -983,7 +983,7 @@
         <w:instrText xml:space="preserve"> PAGEREF _Toc2094298 \h </w:instrText>
         <w:fldChar w:fldCharType="separate"/>
       </w:r>
-      <w:del w:id="19" w:author="AtomizerTest" w:date="2026-02-20T03:04:20Z">
+      <w:del w:id="19" w:author="AtomizerTest" w:date="2026-02-21T02:16:04Z">
         <w:r>
           <w:rPr>
             <w:noProof/>
@@ -992,7 +992,7 @@
           <w:fldChar w:fldCharType="end"/>
         </w:r>
       </w:del>
-      <w:ins w:id="20" w:author="AtomizerTest" w:date="2026-02-20T03:04:20Z">
+      <w:ins w:id="20" w:author="AtomizerTest" w:date="2026-02-21T02:16:04Z">
         <w:r>
           <w:rPr>
             <w:noProof/>
@@ -1025,7 +1025,7 @@
         <w:instrText xml:space="preserve"> PAGEREF _Toc2094299 \h </w:instrText>
         <w:fldChar w:fldCharType="separate"/>
       </w:r>
-      <w:del w:id="21" w:author="AtomizerTest" w:date="2026-02-20T03:04:20Z">
+      <w:del w:id="21" w:author="AtomizerTest" w:date="2026-02-21T02:16:04Z">
         <w:r>
           <w:rPr>
             <w:noProof/>
@@ -1034,7 +1034,7 @@
           <w:fldChar w:fldCharType="end"/>
         </w:r>
       </w:del>
-      <w:ins w:id="22" w:author="AtomizerTest" w:date="2026-02-20T03:04:20Z">
+      <w:ins w:id="22" w:author="AtomizerTest" w:date="2026-02-21T02:16:04Z">
         <w:r>
           <w:rPr>
             <w:noProof/>
@@ -1067,7 +1067,7 @@
         <w:instrText xml:space="preserve"> PAGEREF _Toc2094300 \h </w:instrText>
         <w:fldChar w:fldCharType="separate"/>
       </w:r>
-      <w:del w:id="23" w:author="AtomizerTest" w:date="2026-02-20T03:04:20Z">
+      <w:del w:id="23" w:author="AtomizerTest" w:date="2026-02-21T02:16:04Z">
         <w:r>
           <w:rPr>
             <w:noProof/>
@@ -1076,7 +1076,7 @@
           <w:fldChar w:fldCharType="end"/>
         </w:r>
       </w:del>
-      <w:ins w:id="24" w:author="AtomizerTest" w:date="2026-02-20T03:04:20Z">
+      <w:ins w:id="24" w:author="AtomizerTest" w:date="2026-02-21T02:16:04Z">
         <w:r>
           <w:rPr>
             <w:noProof/>
@@ -1107,7 +1107,7 @@
         <w:tab/>
         <w:fldChar w:fldCharType="begin"/>
       </w:r>
-      <w:del w:id="25" w:author="AtomizerTest" w:date="2026-02-20T03:04:20Z">
+      <w:del w:id="25" w:author="AtomizerTest" w:date="2026-02-21T02:16:04Z">
         <w:r>
           <w:rPr>
             <w:noProof/>
@@ -1116,7 +1116,7 @@
           <w:instrText xml:space="preserve">094301 \h </w:instrText>
         </w:r>
       </w:del>
-      <w:ins w:id="26" w:author="AtomizerTest" w:date="2026-02-20T03:04:20Z">
+      <w:ins w:id="26" w:author="AtomizerTest" w:date="2026-02-21T02:16:04Z">
         <w:r>
           <w:rPr>
             <w:noProof/>
@@ -1156,7 +1156,7 @@
         <w:instrText xml:space="preserve"> PAGEREF _Toc2094302 \h </w:instrText>
         <w:fldChar w:fldCharType="separate"/>
       </w:r>
-      <w:del w:id="27" w:author="AtomizerTest" w:date="2026-02-20T03:04:20Z">
+      <w:del w:id="27" w:author="AtomizerTest" w:date="2026-02-21T02:16:04Z">
         <w:r>
           <w:rPr>
             <w:noProof/>
@@ -1165,7 +1165,7 @@
           <w:fldChar w:fldCharType="end"/>
         </w:r>
       </w:del>
-      <w:ins w:id="28" w:author="AtomizerTest" w:date="2026-02-20T03:04:20Z">
+      <w:ins w:id="28" w:author="AtomizerTest" w:date="2026-02-21T02:16:04Z">
         <w:r>
           <w:rPr>
             <w:noProof/>
@@ -1224,7 +1224,7 @@
         <w:instrText xml:space="preserve"> PAGEREF _Toc2094304 \h </w:instrText>
         <w:fldChar w:fldCharType="separate"/>
       </w:r>
-      <w:del w:id="29" w:author="AtomizerTest" w:date="2026-02-20T03:04:20Z">
+      <w:del w:id="29" w:author="AtomizerTest" w:date="2026-02-21T02:16:04Z">
         <w:r>
           <w:rPr>
             <w:noProof/>
@@ -1233,7 +1233,7 @@
           <w:fldChar w:fldCharType="end"/>
         </w:r>
       </w:del>
-      <w:ins w:id="30" w:author="AtomizerTest" w:date="2026-02-20T03:04:20Z">
+      <w:ins w:id="30" w:author="AtomizerTest" w:date="2026-02-21T02:16:04Z">
         <w:r>
           <w:rPr>
             <w:noProof/>
@@ -1266,7 +1266,7 @@
         <w:instrText xml:space="preserve"> PAGEREF _Toc2094305 \h </w:instrText>
         <w:fldChar w:fldCharType="separate"/>
       </w:r>
-      <w:del w:id="31" w:author="AtomizerTest" w:date="2026-02-20T03:04:20Z">
+      <w:del w:id="31" w:author="AtomizerTest" w:date="2026-02-21T02:16:04Z">
         <w:r>
           <w:rPr>
             <w:noProof/>
@@ -1275,7 +1275,7 @@
           <w:fldChar w:fldCharType="end"/>
         </w:r>
       </w:del>
-      <w:ins w:id="32" w:author="AtomizerTest" w:date="2026-02-20T03:04:20Z">
+      <w:ins w:id="32" w:author="AtomizerTest" w:date="2026-02-21T02:16:04Z">
         <w:r>
           <w:rPr>
             <w:noProof/>
@@ -1306,7 +1306,7 @@
         <w:tab/>
         <w:fldChar w:fldCharType="begin"/>
       </w:r>
-      <w:del w:id="33" w:author="AtomizerTest" w:date="2026-02-20T03:04:20Z">
+      <w:del w:id="33" w:author="AtomizerTest" w:date="2026-02-21T02:16:04Z">
         <w:r>
           <w:rPr>
             <w:noProof/>
@@ -1317,7 +1317,7 @@
           <w:fldChar w:fldCharType="end"/>
         </w:r>
       </w:del>
-      <w:ins w:id="34" w:author="AtomizerTest" w:date="2026-02-20T03:04:20Z">
+      <w:ins w:id="34" w:author="AtomizerTest" w:date="2026-02-21T02:16:04Z">
         <w:r>
           <w:rPr>
             <w:noProof/>
@@ -1351,7 +1351,7 @@
         <w:tab/>
         <w:fldChar w:fldCharType="begin"/>
       </w:r>
-      <w:del w:id="35" w:author="AtomizerTest" w:date="2026-02-20T03:04:20Z">
+      <w:del w:id="35" w:author="AtomizerTest" w:date="2026-02-21T02:16:04Z">
         <w:r>
           <w:rPr>
             <w:noProof/>
@@ -1363,7 +1363,7 @@
           <w:fldChar w:fldCharType="end"/>
         </w:r>
       </w:del>
-      <w:ins w:id="36" w:author="AtomizerTest" w:date="2026-02-20T03:04:20Z">
+      <w:ins w:id="36" w:author="AtomizerTest" w:date="2026-02-21T02:16:04Z">
         <w:r>
           <w:rPr>
             <w:noProof/>
@@ -1398,7 +1398,7 @@
         <w:instrText xml:space="preserve"> PAGEREF _Toc2094308 \h </w:instrText>
         <w:fldChar w:fldCharType="separate"/>
       </w:r>
-      <w:del w:id="37" w:author="AtomizerTest" w:date="2026-02-20T03:04:20Z">
+      <w:del w:id="37" w:author="AtomizerTest" w:date="2026-02-21T02:16:04Z">
         <w:r>
           <w:rPr>
             <w:noProof/>
@@ -1407,7 +1407,7 @@
           <w:fldChar w:fldCharType="end"/>
         </w:r>
       </w:del>
-      <w:ins w:id="38" w:author="AtomizerTest" w:date="2026-02-20T03:04:20Z">
+      <w:ins w:id="38" w:author="AtomizerTest" w:date="2026-02-21T02:16:04Z">
         <w:r>
           <w:rPr>
             <w:noProof/>
@@ -1466,7 +1466,7 @@
         <w:instrText xml:space="preserve"> PAGEREF _Toc2094310 \h </w:instrText>
         <w:fldChar w:fldCharType="separate"/>
       </w:r>
-      <w:del w:id="39" w:author="AtomizerTest" w:date="2026-02-20T03:04:20Z">
+      <w:del w:id="39" w:author="AtomizerTest" w:date="2026-02-21T02:16:04Z">
         <w:r>
           <w:rPr>
             <w:noProof/>
@@ -1475,7 +1475,7 @@
           <w:fldChar w:fldCharType="end"/>
         </w:r>
       </w:del>
-      <w:ins w:id="40" w:author="AtomizerTest" w:date="2026-02-20T03:04:20Z">
+      <w:ins w:id="40" w:author="AtomizerTest" w:date="2026-02-21T02:16:04Z">
         <w:r>
           <w:rPr>
             <w:noProof/>
@@ -1532,7 +1532,7 @@
         <w:tab/>
         <w:fldChar w:fldCharType="begin"/>
       </w:r>
-      <w:del w:id="41" w:author="AtomizerTest" w:date="2026-02-20T03:04:20Z">
+      <w:del w:id="41" w:author="AtomizerTest" w:date="2026-02-21T02:16:04Z">
         <w:r>
           <w:rPr>
             <w:noProof/>
@@ -1543,7 +1543,7 @@
           <w:fldChar w:fldCharType="end"/>
         </w:r>
       </w:del>
-      <w:ins w:id="42" w:author="AtomizerTest" w:date="2026-02-20T03:04:20Z">
+      <w:ins w:id="42" w:author="AtomizerTest" w:date="2026-02-21T02:16:04Z">
         <w:r>
           <w:rPr>
             <w:noProof/>
@@ -2169,10 +2169,10 @@
       <w:pPr>
         <w:pStyle w:val="BodyText"/>
         <w:rPr>
-          <w:ins w:id="43" w:author="AtomizerTest" w:date="2026-02-20T03:04:20Z"/>
-        </w:rPr>
-      </w:pPr>
-      <w:ins w:id="44" w:author="AtomizerTest" w:date="2026-02-20T03:04:20Z">
+          <w:ins w:id="43" w:author="AtomizerTest" w:date="2026-02-21T02:16:04Z"/>
+        </w:rPr>
+      </w:pPr>
+      <w:ins w:id="44" w:author="AtomizerTest" w:date="2026-02-21T02:16:04Z">
         <w:r>
           <w:t xml:space="preserve">“Disposition” means the sale, exchange, redemption, maturity, or other disposition by the Fund of all or a portion of a Portfolio Investment, including distributions in kind to the Partners.  For all purposes of this Agreement, an extraordinary dividend, refinancing, capital restructuring or similar transaction or distribution in connection with a Portfolio Investment shall be considered a “Disposition”.</w:t>
         </w:r>
@@ -2185,12 +2185,12 @@
       <w:r>
         <w:t>“Distributable Proceeds” means, as of any date, the excess of (i) the cash received by the Fund from any</w:t>
       </w:r>
-      <w:del w:id="45" w:author="AtomizerTest" w:date="2026-02-20T03:04:20Z">
+      <w:del w:id="45" w:author="AtomizerTest" w:date="2026-02-21T02:16:04Z">
         <w:r>
           <w:delText xml:space="preserve"> sale or other disposition</w:delText>
         </w:r>
       </w:del>
-      <w:ins w:id="46" w:author="AtomizerTest" w:date="2026-02-20T03:04:20Z">
+      <w:ins w:id="46" w:author="AtomizerTest" w:date="2026-02-21T02:16:04Z">
         <w:r>
           <w:t xml:space="preserve"> Disposition</w:t>
         </w:r>
@@ -2293,7 +2293,7 @@
       <w:r>
         <w:t xml:space="preserve">“Escrow Account” has the meaning set forth in Section </w:t>
       </w:r>
-      <w:del w:id="47" w:author="AtomizerTest" w:date="2026-02-20T03:04:20Z">
+      <w:del w:id="47" w:author="AtomizerTest" w:date="2026-02-21T02:16:04Z">
         <w:r>
           <w:fldChar w:fldCharType="begin"/>
           <w:instrText xml:space="preserve"> REF _Ref18675847 \r \h </w:instrText>
@@ -2302,7 +2302,7 @@
           <w:fldChar w:fldCharType="end"/>
         </w:r>
       </w:del>
-      <w:ins w:id="48" w:author="AtomizerTest" w:date="2026-02-20T03:04:20Z">
+      <w:ins w:id="48" w:author="AtomizerTest" w:date="2026-02-21T02:16:04Z">
         <w:r>
           <w:fldChar w:fldCharType="begin"/>
           <w:instrText xml:space="preserve"> REF _Ref34603774 \r \h </w:instrText>
@@ -2758,10 +2758,10 @@
       <w:pPr>
         <w:pStyle w:val="BodyText"/>
         <w:rPr>
-          <w:ins w:id="49" w:author="AtomizerTest" w:date="2026-02-20T03:04:20Z"/>
-        </w:rPr>
-      </w:pPr>
-      <w:ins w:id="50" w:author="AtomizerTest" w:date="2026-02-20T03:04:20Z">
+          <w:ins w:id="49" w:author="AtomizerTest" w:date="2026-02-21T02:16:04Z"/>
+        </w:rPr>
+      </w:pPr>
+      <w:ins w:id="50" w:author="AtomizerTest" w:date="2026-02-21T02:16:04Z">
         <w:r>
           <w:t xml:space="preserve">“Interim Clawback Amount” has the meaning set forth in Section </w:t>
           <w:fldChar w:fldCharType="begin"/>
@@ -2777,10 +2777,10 @@
       <w:pPr>
         <w:pStyle w:val="BodyText"/>
         <w:rPr>
-          <w:ins w:id="51" w:author="AtomizerTest" w:date="2026-02-20T03:04:20Z"/>
-        </w:rPr>
-      </w:pPr>
-      <w:ins w:id="52" w:author="AtomizerTest" w:date="2026-02-20T03:04:20Z">
+          <w:ins w:id="51" w:author="AtomizerTest" w:date="2026-02-21T02:16:04Z"/>
+        </w:rPr>
+      </w:pPr>
+      <w:ins w:id="52" w:author="AtomizerTest" w:date="2026-02-21T02:16:04Z">
         <w:r>
           <w:t xml:space="preserve">“Interim Clawback Date” has the meaning set forth in Section </w:t>
           <w:fldChar w:fldCharType="begin"/>
@@ -2796,10 +2796,10 @@
       <w:pPr>
         <w:pStyle w:val="BodyText"/>
         <w:rPr>
-          <w:ins w:id="53" w:author="AtomizerTest" w:date="2026-02-20T03:04:20Z"/>
-        </w:rPr>
-      </w:pPr>
-      <w:ins w:id="54" w:author="AtomizerTest" w:date="2026-02-20T03:04:20Z">
+          <w:ins w:id="53" w:author="AtomizerTest" w:date="2026-02-21T02:16:04Z"/>
+        </w:rPr>
+      </w:pPr>
+      <w:ins w:id="54" w:author="AtomizerTest" w:date="2026-02-21T02:16:04Z">
         <w:r>
           <w:t xml:space="preserve">“Interim Clawback Obligation” has the meaning set forth in Section </w:t>
           <w:fldChar w:fldCharType="begin"/>
@@ -3048,12 +3048,12 @@
       <w:r>
         <w:t>“Non-Defaulting Partners” has the meaning set forth in Section </w:t>
       </w:r>
-      <w:del w:id="55" w:author="AtomizerTest" w:date="2026-02-20T03:04:20Z">
+      <w:del w:id="55" w:author="AtomizerTest" w:date="2026-02-21T02:16:04Z">
         <w:r>
           <w:delText>6.6.3.</w:delText>
         </w:r>
       </w:del>
-      <w:ins w:id="56" w:author="AtomizerTest" w:date="2026-02-20T03:04:20Z">
+      <w:ins w:id="56" w:author="AtomizerTest" w:date="2026-02-21T02:16:04Z">
         <w:r>
           <w:fldChar w:fldCharType="begin"/>
           <w:instrText xml:space="preserve"> REF _Ref18679391 \r \h </w:instrText>
@@ -3250,12 +3250,12 @@
       <w:r>
         <w:t xml:space="preserve">“Preferred Return” means, with respect to each Partner (other than an Affiliated Partner), as of any date of determination, such amount as is equal to an annual rate of return of [8]%, compounded annually and calculated daily on the Capital Contributions made by such Limited </w:t>
       </w:r>
-      <w:del w:id="57" w:author="AtomizerTest" w:date="2026-02-20T03:04:20Z">
+      <w:del w:id="57" w:author="AtomizerTest" w:date="2026-02-21T02:16:04Z">
         <w:r>
           <w:delText>Partner,</w:delText>
         </w:r>
       </w:del>
-      <w:ins w:id="58" w:author="AtomizerTest" w:date="2026-02-20T03:04:20Z">
+      <w:ins w:id="58" w:author="AtomizerTest" w:date="2026-02-21T02:16:04Z">
         <w:r>
           <w:t xml:space="preserve">Partner described in Section </w:t>
           <w:fldChar w:fldCharType="begin"/>
@@ -3325,10 +3325,10 @@
       <w:pPr>
         <w:pStyle w:val="BodyText"/>
         <w:rPr>
-          <w:ins w:id="59" w:author="AtomizerTest" w:date="2026-02-20T03:04:20Z"/>
-        </w:rPr>
-      </w:pPr>
-      <w:ins w:id="60" w:author="AtomizerTest" w:date="2026-02-20T03:04:20Z">
+          <w:ins w:id="59" w:author="AtomizerTest" w:date="2026-02-21T02:16:04Z"/>
+        </w:rPr>
+      </w:pPr>
+      <w:ins w:id="60" w:author="AtomizerTest" w:date="2026-02-21T02:16:04Z">
         <w:r>
           <w:t>“Realized Investment” means, as of any date of determination, each Portfolio Investment (other than Temporary Investments) that has been the subject of a Disposition.</w:t>
         </w:r>
@@ -3817,10 +3817,10 @@
       <w:pPr>
         <w:pStyle w:val="BodyText"/>
         <w:rPr>
-          <w:ins w:id="61" w:author="AtomizerTest" w:date="2026-02-20T03:04:20Z"/>
-        </w:rPr>
-      </w:pPr>
-      <w:ins w:id="62" w:author="AtomizerTest" w:date="2026-02-20T03:04:20Z">
+          <w:ins w:id="61" w:author="AtomizerTest" w:date="2026-02-21T02:16:04Z"/>
+        </w:rPr>
+      </w:pPr>
+      <w:ins w:id="62" w:author="AtomizerTest" w:date="2026-02-21T02:16:04Z">
         <w:r>
           <w:t>“Unrealized Investment” means each Portfolio Investment other than Temporary Investments and Realized Investments.</w:t>
         </w:r>
@@ -3830,10 +3830,10 @@
       <w:pPr>
         <w:pStyle w:val="BodyText"/>
         <w:rPr>
-          <w:ins w:id="63" w:author="AtomizerTest" w:date="2026-02-20T03:04:20Z"/>
-        </w:rPr>
-      </w:pPr>
-      <w:ins w:id="64" w:author="AtomizerTest" w:date="2026-02-20T03:04:20Z">
+          <w:ins w:id="63" w:author="AtomizerTest" w:date="2026-02-21T02:16:04Z"/>
+        </w:rPr>
+      </w:pPr>
+      <w:ins w:id="64" w:author="AtomizerTest" w:date="2026-02-21T02:16:04Z">
         <w:r>
           <w:t>“Unrealized Loss” shall mean, with respect to each Partner and each Unrealized Investment, as of any date of determination, the excess, if any, of (i) the Capital Contributions of such Partner used to fund the cost of such Unrealized Investment (including any expenses incurred in making or maintaining such Portfolio Investment) over (ii) the product of (A) the Value of such Unrealized Investment as of such date of determination and (B) such Partner’s Sharing Percentage for such Unrealized Investment.</w:t>
         </w:r>
@@ -3846,7 +3846,7 @@
           <w:b/>
         </w:rPr>
       </w:pPr>
-      <w:ins w:id="65" w:author="AtomizerTest" w:date="2026-02-20T03:04:20Z">
+      <w:ins w:id="65" w:author="AtomizerTest" w:date="2026-02-21T02:16:04Z">
         <w:r>
           <w:t xml:space="preserve"> </w:t>
         </w:r>
@@ -4134,12 +4134,12 @@
         <w:tab/>
         <w:t xml:space="preserve">engage in such other activities as are necessary, advisable, lawful and consistent with the foregoing, (the “Investment Objectives”), in all cases in accordance with the Investment Policy, </w:t>
       </w:r>
-      <w:del w:id="66" w:author="AtomizerTest" w:date="2026-02-20T03:04:20Z">
+      <w:del w:id="66" w:author="AtomizerTest" w:date="2026-02-21T02:16:04Z">
         <w:r>
           <w:delText>Section </w:delText>
         </w:r>
       </w:del>
-      <w:ins w:id="67" w:author="AtomizerTest" w:date="2026-02-20T03:04:20Z">
+      <w:ins w:id="67" w:author="AtomizerTest" w:date="2026-02-21T02:16:04Z">
         <w:r>
           <w:t>Section </w:t>
         </w:r>
@@ -4658,7 +4658,7 @@
       </w:r>
       <w:r>
         <w:rPr>
-          <w:rPrChange w:id="68" w:author="AtomizerTest" w:date="2026-02-20T03:04:20Z">
+          <w:rPrChange w:id="68" w:author="AtomizerTest" w:date="2026-02-21T02:16:04Z">
             <w:u w:color="0000FF"/>
           </w:rPrChange>
         </w:rPr>
@@ -4696,7 +4696,7 @@
         <w:t>Section</w:t>
         <w:t xml:space="preserve"> </w:t>
       </w:r>
-      <w:del w:id="69" w:author="AtomizerTest" w:date="2026-02-20T03:04:20Z">
+      <w:del w:id="69" w:author="AtomizerTest" w:date="2026-02-21T02:16:04Z">
         <w:r>
           <w:rPr>
             <w:u w:color="0000FF"/>
@@ -4704,7 +4704,7 @@
           <w:delText>14.7.3,</w:delText>
         </w:r>
       </w:del>
-      <w:ins w:id="70" w:author="AtomizerTest" w:date="2026-02-20T03:04:20Z">
+      <w:ins w:id="70" w:author="AtomizerTest" w:date="2026-02-21T02:16:04Z">
         <w:r>
           <w:fldChar w:fldCharType="begin"/>
           <w:instrText xml:space="preserve"> REF _Ref40095493 \r \h </w:instrText>
@@ -6404,7 +6404,7 @@
           <w:tab w:val="left" w:pos="2520"/>
         </w:tabs>
       </w:pPr>
-      <w:del w:id="71" w:author="AtomizerTest" w:date="2026-02-20T03:04:20Z">
+      <w:del w:id="71" w:author="AtomizerTest" w:date="2026-02-21T02:16:04Z">
         <w:r>
           <w:tab/>
         </w:r>
@@ -6920,7 +6920,7 @@
         <w:fldChar w:fldCharType="end"/>
         <w:t xml:space="preserve"> (Key Person Event; Suspension), [__]% per annum of the Capital Contributions made by such Limited Partner to fund the Acquisition Cost of Portfolio Investments other than Temporary Investments, less an amount equal to the Acquisition Cost of Portfolio Investments, other than Temporary Investments, that have been realized (in whole or in part), written off or Permanently Written Down as of the end of the most recent financial quarter.</w:t>
       </w:r>
-      <w:del w:id="72" w:author="AtomizerTest" w:date="2026-02-20T03:04:20Z">
+      <w:del w:id="72" w:author="AtomizerTest" w:date="2026-02-21T02:16:04Z">
         <w:r>
           <w:delText xml:space="preserve"> </w:delText>
         </w:r>
@@ -7703,7 +7703,7 @@
         <w:fldChar w:fldCharType="end"/>
         <w:t xml:space="preserve"> (Distributions; Allocations)) shall immediately and automatically terminate, no further distributions of Carried Interest shall be made to the removed General Partner, and any amounts retained in the Escrow Account pursuant to Section </w:t>
       </w:r>
-      <w:del w:id="73" w:author="AtomizerTest" w:date="2026-02-20T03:04:20Z">
+      <w:del w:id="73" w:author="AtomizerTest" w:date="2026-02-21T02:16:04Z">
         <w:r>
           <w:fldChar w:fldCharType="begin"/>
           <w:instrText xml:space="preserve"> REF _Ref18675847 \r \h </w:instrText>
@@ -7712,7 +7712,7 @@
           <w:fldChar w:fldCharType="end"/>
         </w:r>
       </w:del>
-      <w:ins w:id="74" w:author="AtomizerTest" w:date="2026-02-20T03:04:20Z">
+      <w:ins w:id="74" w:author="AtomizerTest" w:date="2026-02-21T02:16:04Z">
         <w:r>
           <w:fldChar w:fldCharType="begin"/>
           <w:instrText xml:space="preserve"> REF _Ref34603774 \r \h </w:instrText>
@@ -8078,7 +8078,7 @@
         <w:fldChar w:fldCharType="end"/>
         <w:t xml:space="preserve"> (Winding Up); provided that with respect to a termination of the Fund on delivery of a Removal for Cause Notice, the right of the General Partner to receive further distributions of Carried Interest from the Fund shall immediately and automatically terminate, no further distributions of Carried Interest shall be made to the General Partner, and any amounts retained in the Escrow Account pursuant to Section</w:t>
       </w:r>
-      <w:del w:id="75" w:author="AtomizerTest" w:date="2026-02-20T03:04:20Z">
+      <w:del w:id="75" w:author="AtomizerTest" w:date="2026-02-21T02:16:04Z">
         <w:r>
           <w:delText xml:space="preserve"> </w:delText>
           <w:fldChar w:fldCharType="begin"/>
@@ -8088,7 +8088,7 @@
           <w:fldChar w:fldCharType="end"/>
         </w:r>
       </w:del>
-      <w:ins w:id="76" w:author="AtomizerTest" w:date="2026-02-20T03:04:20Z">
+      <w:ins w:id="76" w:author="AtomizerTest" w:date="2026-02-21T02:16:04Z">
         <w:r>
           <w:t> </w:t>
           <w:fldChar w:fldCharType="begin"/>
@@ -9031,12 +9031,12 @@
         <w:fldChar w:fldCharType="end"/>
         <w:t xml:space="preserve"> equal to </w:t>
       </w:r>
-      <w:del w:id="77" w:author="AtomizerTest" w:date="2026-02-20T03:04:20Z">
+      <w:del w:id="77" w:author="AtomizerTest" w:date="2026-02-21T02:16:04Z">
         <w:r>
           <w:delText>such Partner’s aggregate Capital Contributions;</w:delText>
         </w:r>
       </w:del>
-      <w:ins w:id="78" w:author="AtomizerTest" w:date="2026-02-20T03:04:20Z">
+      <w:ins w:id="78" w:author="AtomizerTest" w:date="2026-02-21T02:16:04Z">
         <w:r>
           <w:t>the sum of (without duplication):</w:t>
         </w:r>
@@ -9050,10 +9050,10 @@
         </w:tabs>
         <w:ind w:left="720" w:firstLine="720"/>
         <w:rPr>
-          <w:ins w:id="79" w:author="AtomizerTest" w:date="2026-02-20T03:04:20Z"/>
-        </w:rPr>
-      </w:pPr>
-      <w:ins w:id="80" w:author="AtomizerTest" w:date="2026-02-20T03:04:20Z">
+          <w:ins w:id="79" w:author="AtomizerTest" w:date="2026-02-21T02:16:04Z"/>
+        </w:rPr>
+      </w:pPr>
+      <w:ins w:id="80" w:author="AtomizerTest" w:date="2026-02-21T02:16:04Z">
         <w:r>
           <w:tab/>
           <w:t>the Capital Contributions of such Partner used to fund the cost of (i) such Portfolio Investment, (ii) each Realized Investment, and (iii) aggregate Unrealized Losses; and</w:t>
@@ -9068,10 +9068,10 @@
         </w:tabs>
         <w:ind w:left="720" w:firstLine="720"/>
         <w:rPr>
-          <w:ins w:id="81" w:author="AtomizerTest" w:date="2026-02-20T03:04:20Z"/>
-        </w:rPr>
-      </w:pPr>
-      <w:ins w:id="82" w:author="AtomizerTest" w:date="2026-02-20T03:04:20Z">
+          <w:ins w:id="81" w:author="AtomizerTest" w:date="2026-02-21T02:16:04Z"/>
+        </w:rPr>
+      </w:pPr>
+      <w:ins w:id="82" w:author="AtomizerTest" w:date="2026-02-21T02:16:04Z">
         <w:r>
           <w:tab/>
           <w:t>the Capital Contributions of such Partner used to fund Fund Expenses including the Management Fee;</w:t>
@@ -9115,7 +9115,7 @@
         <w:tab/>
         <w:t>Third,</w:t>
       </w:r>
-      <w:ins w:id="83" w:author="AtomizerTest" w:date="2026-02-20T03:04:20Z">
+      <w:ins w:id="83" w:author="AtomizerTest" w:date="2026-02-21T02:16:04Z">
         <w:r>
           <w:t xml:space="preserve"> either (i)</w:t>
         </w:r>
@@ -9123,12 +9123,12 @@
       <w:r>
         <w:t xml:space="preserve"> [80]% to the General Partner and [20]% to such Partner </w:t>
       </w:r>
-      <w:del w:id="84" w:author="AtomizerTest" w:date="2026-02-20T03:04:20Z">
+      <w:del w:id="84" w:author="AtomizerTest" w:date="2026-02-21T02:16:04Z">
         <w:r>
           <w:delText>until the General Partner has received</w:delText>
         </w:r>
       </w:del>
-      <w:ins w:id="85" w:author="AtomizerTest" w:date="2026-02-20T03:04:20Z">
+      <w:ins w:id="85" w:author="AtomizerTest" w:date="2026-02-21T02:16:04Z">
         <w:r>
           <w:t>or (ii) 100% to such Partner, as appropriate, until the</w:t>
         </w:r>
@@ -9136,7 +9136,7 @@
       <w:r>
         <w:t xml:space="preserve"> cumulative distributions</w:t>
       </w:r>
-      <w:ins w:id="86" w:author="AtomizerTest" w:date="2026-02-20T03:04:20Z">
+      <w:ins w:id="86" w:author="AtomizerTest" w:date="2026-02-21T02:16:04Z">
         <w:r>
           <w:t xml:space="preserve"> received by the General Partner</w:t>
         </w:r>
@@ -9144,7 +9144,7 @@
       <w:r>
         <w:t xml:space="preserve"> with respect to such Partner pursuant to</w:t>
       </w:r>
-      <w:del w:id="87" w:author="AtomizerTest" w:date="2026-02-20T03:04:20Z">
+      <w:del w:id="87" w:author="AtomizerTest" w:date="2026-02-21T02:16:04Z">
         <w:r>
           <w:delText xml:space="preserve"> this</w:delText>
         </w:r>
@@ -9152,7 +9152,7 @@
       <w:r>
         <w:t xml:space="preserve"> Section </w:t>
       </w:r>
-      <w:del w:id="88" w:author="AtomizerTest" w:date="2026-02-20T03:04:20Z">
+      <w:del w:id="88" w:author="AtomizerTest" w:date="2026-02-21T02:16:04Z">
         <w:r>
           <w:fldChar w:fldCharType="begin"/>
           <w:instrText xml:space="preserve"> REF _Ref437891131 \r \h </w:instrText>
@@ -9161,7 +9161,7 @@
           <w:fldChar w:fldCharType="end"/>
         </w:r>
       </w:del>
-      <w:ins w:id="89" w:author="AtomizerTest" w:date="2026-02-20T03:04:20Z">
+      <w:ins w:id="89" w:author="AtomizerTest" w:date="2026-02-21T02:16:04Z">
         <w:r>
           <w:fldChar w:fldCharType="begin"/>
           <w:instrText xml:space="preserve"> REF _Ref18679183 \r \h </w:instrText>
@@ -9173,7 +9173,7 @@
       <w:r>
         <w:t xml:space="preserve"> equal to [20]%</w:t>
       </w:r>
-      <w:ins w:id="90" w:author="AtomizerTest" w:date="2026-02-20T03:04:20Z">
+      <w:ins w:id="90" w:author="AtomizerTest" w:date="2026-02-21T02:16:04Z">
         <w:r>
           <w:t xml:space="preserve"> of the excess</w:t>
         </w:r>
@@ -9181,7 +9181,7 @@
       <w:r>
         <w:t xml:space="preserve"> of</w:t>
       </w:r>
-      <w:ins w:id="91" w:author="AtomizerTest" w:date="2026-02-20T03:04:20Z">
+      <w:ins w:id="91" w:author="AtomizerTest" w:date="2026-02-21T02:16:04Z">
         <w:r>
           <w:t xml:space="preserve"> (x)</w:t>
         </w:r>
@@ -9189,7 +9189,7 @@
       <w:r>
         <w:t xml:space="preserve"> the cumulative amount of distributions made or being made to</w:t>
       </w:r>
-      <w:del w:id="92" w:author="AtomizerTest" w:date="2026-02-20T03:04:20Z">
+      <w:del w:id="92" w:author="AtomizerTest" w:date="2026-02-21T02:16:04Z">
         <w:r>
           <w:delText xml:space="preserve"> (i)</w:delText>
         </w:r>
@@ -9197,7 +9197,7 @@
       <w:r>
         <w:t xml:space="preserve"> such Partner</w:t>
       </w:r>
-      <w:del w:id="93" w:author="AtomizerTest" w:date="2026-02-20T03:04:20Z">
+      <w:del w:id="93" w:author="AtomizerTest" w:date="2026-02-21T02:16:04Z">
         <w:r>
           <w:delText xml:space="preserve"> pursuant to Section </w:delText>
           <w:fldChar w:fldCharType="begin"/>
@@ -9217,12 +9217,12 @@
       <w:r>
         <w:t xml:space="preserve"> and </w:t>
       </w:r>
-      <w:del w:id="94" w:author="AtomizerTest" w:date="2026-02-20T03:04:20Z">
+      <w:del w:id="94" w:author="AtomizerTest" w:date="2026-02-21T02:16:04Z">
         <w:r>
           <w:delText>(ii)</w:delText>
         </w:r>
       </w:del>
-      <w:ins w:id="95" w:author="AtomizerTest" w:date="2026-02-20T03:04:20Z">
+      <w:ins w:id="95" w:author="AtomizerTest" w:date="2026-02-21T02:16:04Z">
         <w:r>
           <w:t>to</w:t>
         </w:r>
@@ -9230,7 +9230,7 @@
       <w:r>
         <w:t xml:space="preserve"> the General Partner with respect to such Partner pursuant to</w:t>
       </w:r>
-      <w:del w:id="96" w:author="AtomizerTest" w:date="2026-02-20T03:04:20Z">
+      <w:del w:id="96" w:author="AtomizerTest" w:date="2026-02-21T02:16:04Z">
         <w:r>
           <w:delText xml:space="preserve"> this</w:delText>
         </w:r>
@@ -9238,7 +9238,7 @@
       <w:r>
         <w:t xml:space="preserve"> Section </w:t>
       </w:r>
-      <w:del w:id="97" w:author="AtomizerTest" w:date="2026-02-20T03:04:20Z">
+      <w:del w:id="97" w:author="AtomizerTest" w:date="2026-02-21T02:16:04Z">
         <w:r>
           <w:fldChar w:fldCharType="begin"/>
           <w:instrText xml:space="preserve"> REF _Ref437891131 \r \h </w:instrText>
@@ -9247,7 +9247,7 @@
           <w:fldChar w:fldCharType="end"/>
         </w:r>
       </w:del>
-      <w:ins w:id="98" w:author="AtomizerTest" w:date="2026-02-20T03:04:20Z">
+      <w:ins w:id="98" w:author="AtomizerTest" w:date="2026-02-21T02:16:04Z">
         <w:r>
           <w:fldChar w:fldCharType="begin"/>
           <w:instrText xml:space="preserve"> REF _Ref18679183 \r \h </w:instrText>
@@ -9493,12 +9493,12 @@
         <w:tab/>
         <w:t xml:space="preserve">For purposes of this Section </w:t>
       </w:r>
-      <w:del w:id="99" w:author="AtomizerTest" w:date="2026-02-20T03:04:20Z">
+      <w:del w:id="99" w:author="AtomizerTest" w:date="2026-02-21T02:16:04Z">
         <w:r>
           <w:delText>14.6,</w:delText>
         </w:r>
       </w:del>
-      <w:ins w:id="100" w:author="AtomizerTest" w:date="2026-02-20T03:04:20Z">
+      <w:ins w:id="100" w:author="AtomizerTest" w:date="2026-02-21T02:16:04Z">
         <w:r>
           <w:fldChar w:fldCharType="begin"/>
           <w:instrText xml:space="preserve"> REF _Ref18682218 \r \h </w:instrText>
@@ -9550,7 +9550,7 @@
         <w:tab/>
         <w:t>If, upon</w:t>
       </w:r>
-      <w:del w:id="101" w:author="AtomizerTest" w:date="2026-02-20T03:04:20Z">
+      <w:del w:id="101" w:author="AtomizerTest" w:date="2026-02-21T02:16:04Z">
         <w:r>
           <w:delText xml:space="preserve"> any of</w:delText>
         </w:r>
@@ -9558,7 +9558,7 @@
       <w:r>
         <w:t xml:space="preserve"> (i)</w:t>
       </w:r>
-      <w:del w:id="102" w:author="AtomizerTest" w:date="2026-02-20T03:04:20Z">
+      <w:del w:id="102" w:author="AtomizerTest" w:date="2026-02-21T02:16:04Z">
         <w:r>
           <w:delText xml:space="preserve"> the first anniversary following the end of the Commitment Period, (ii) a Removal Date, (iii)</w:delText>
         </w:r>
@@ -9571,7 +9571,7 @@
         <w:t>18.3.2.2</w:t>
         <w:fldChar w:fldCharType="end"/>
       </w:r>
-      <w:del w:id="103" w:author="AtomizerTest" w:date="2026-02-20T03:04:20Z">
+      <w:del w:id="103" w:author="AtomizerTest" w:date="2026-02-21T02:16:04Z">
         <w:r>
           <w:delText>;</w:delText>
         </w:r>
@@ -9579,12 +9579,12 @@
       <w:r>
         <w:t xml:space="preserve"> or </w:t>
       </w:r>
-      <w:del w:id="104" w:author="AtomizerTest" w:date="2026-02-20T03:04:20Z">
+      <w:del w:id="104" w:author="AtomizerTest" w:date="2026-02-21T02:16:04Z">
         <w:r>
           <w:delText>(iv)</w:delText>
         </w:r>
       </w:del>
-      <w:ins w:id="105" w:author="AtomizerTest" w:date="2026-02-20T03:04:20Z">
+      <w:ins w:id="105" w:author="AtomizerTest" w:date="2026-02-21T02:16:04Z">
         <w:r>
           <w:t>(ii)</w:t>
         </w:r>
@@ -9598,7 +9598,7 @@
         <w:fldChar w:fldCharType="end"/>
         <w:t xml:space="preserve"> (Limited Partner </w:t>
       </w:r>
-      <w:del w:id="106" w:author="AtomizerTest" w:date="2026-02-20T03:04:20Z">
+      <w:del w:id="106" w:author="AtomizerTest" w:date="2026-02-21T02:16:04Z">
         <w:r>
           <w:rPr>
             <w:i/>
@@ -9606,7 +9606,7 @@
           <w:delText>Giveback),</w:delText>
         </w:r>
       </w:del>
-      <w:ins w:id="107" w:author="AtomizerTest" w:date="2026-02-20T03:04:20Z">
+      <w:ins w:id="107" w:author="AtomizerTest" w:date="2026-02-21T02:16:04Z">
         <w:r>
           <w:rPr>
             <w:i/>
@@ -9663,12 +9663,12 @@
         <w:fldChar w:fldCharType="end"/>
         <w:t xml:space="preserve"> (Winding Up) attributable to such Limited Partner that exceed the amount of distributions of Carried Interest that the General Partner should have received, taking into account in the aggregate all Capital Contributions, all distributions by the Fund pursuant to Section</w:t>
       </w:r>
-      <w:del w:id="108" w:author="AtomizerTest" w:date="2026-02-20T03:04:20Z">
+      <w:del w:id="108" w:author="AtomizerTest" w:date="2026-02-21T02:16:04Z">
         <w:r>
           <w:delText xml:space="preserve"> </w:delText>
         </w:r>
       </w:del>
-      <w:ins w:id="109" w:author="AtomizerTest" w:date="2026-02-20T03:04:20Z">
+      <w:ins w:id="109" w:author="AtomizerTest" w:date="2026-02-21T02:16:04Z">
         <w:r>
           <w:t> </w:t>
         </w:r>
@@ -9700,12 +9700,12 @@
         <w:fldChar w:fldCharType="end"/>
         <w:t xml:space="preserve"> (Limited Partner Giveback) attributable to such Limited</w:t>
       </w:r>
-      <w:del w:id="110" w:author="AtomizerTest" w:date="2026-02-20T03:04:20Z">
+      <w:del w:id="110" w:author="AtomizerTest" w:date="2026-02-21T02:16:04Z">
         <w:r>
           <w:delText xml:space="preserve"> Partner at such time;</w:delText>
         </w:r>
       </w:del>
-      <w:ins w:id="111" w:author="AtomizerTest" w:date="2026-02-20T03:04:20Z">
+      <w:ins w:id="111" w:author="AtomizerTest" w:date="2026-02-21T02:16:04Z">
         <w:r>
           <w:t xml:space="preserve"> Partner;</w:t>
         </w:r>
@@ -9862,10 +9862,10 @@
         </w:tabs>
         <w:ind w:left="0" w:firstLine="720"/>
         <w:rPr>
-          <w:ins w:id="112" w:author="AtomizerTest" w:date="2026-02-20T03:04:20Z"/>
-        </w:rPr>
-      </w:pPr>
-      <w:ins w:id="113" w:author="AtomizerTest" w:date="2026-02-20T03:04:20Z">
+          <w:ins w:id="112" w:author="AtomizerTest" w:date="2026-02-21T02:16:04Z"/>
+        </w:rPr>
+      </w:pPr>
+      <w:ins w:id="113" w:author="AtomizerTest" w:date="2026-02-21T02:16:04Z">
         <w:r>
           <w:tab/>
           <w:t>If, upon any of (i) the first anniversary following the end of the Commitment Period and [every year] thereafter, (ii) a Removal Date, or (iii) any re-advance of any amounts pursuant to Section </w:t>
@@ -9985,7 +9985,7 @@
       <w:r>
         <w:rPr>
           <w:highlight w:val="yellow"/>
-          <w:rPrChange w:id="114" w:author="AtomizerTest" w:date="2026-02-20T03:04:20Z">
+          <w:rPrChange w:id="114" w:author="AtomizerTest" w:date="2026-02-21T02:16:04Z">
             <w:b/>
             <w:highlight w:val="yellow"/>
           </w:rPrChange>
@@ -10015,7 +10015,7 @@
         <w:fldChar w:fldCharType="end"/>
         <w:t>, which amount shall be distributed to the relevant Partner in accordance with the provisions thereof.]</w:t>
       </w:r>
-      <w:ins w:id="115" w:author="AtomizerTest" w:date="2026-02-20T03:04:20Z">
+      <w:ins w:id="115" w:author="AtomizerTest" w:date="2026-02-21T02:16:04Z">
         <w:r>
           <w:t xml:space="preserve"> </w:t>
         </w:r>
@@ -10034,7 +10034,7 @@
       </w:r>
       <w:r>
         <w:rPr>
-          <w:rPrChange w:id="116" w:author="AtomizerTest" w:date="2026-02-20T03:04:20Z">
+          <w:rPrChange w:id="116" w:author="AtomizerTest" w:date="2026-02-21T02:16:04Z">
             <w:u w:color="0000FF"/>
           </w:rPrChange>
         </w:rPr>
@@ -10075,7 +10075,7 @@
         <w:t>Section</w:t>
         <w:t xml:space="preserve"> </w:t>
       </w:r>
-      <w:del w:id="117" w:author="AtomizerTest" w:date="2026-02-20T03:04:20Z">
+      <w:del w:id="117" w:author="AtomizerTest" w:date="2026-02-21T02:16:04Z">
         <w:r>
           <w:rPr>
             <w:u w:color="0000FF"/>
@@ -10087,7 +10087,7 @@
           <w:fldChar w:fldCharType="end"/>
         </w:r>
       </w:del>
-      <w:ins w:id="118" w:author="AtomizerTest" w:date="2026-02-20T03:04:20Z">
+      <w:ins w:id="118" w:author="AtomizerTest" w:date="2026-02-21T02:16:04Z">
         <w:r>
           <w:fldChar w:fldCharType="begin"/>
           <w:instrText xml:space="preserve"> REF _Ref40095031 \r \h </w:instrText>
@@ -10098,7 +10098,7 @@
       </w:ins>
       <w:r>
         <w:rPr>
-          <w:rPrChange w:id="119" w:author="AtomizerTest" w:date="2026-02-20T03:04:20Z">
+          <w:rPrChange w:id="119" w:author="AtomizerTest" w:date="2026-02-21T02:16:04Z">
             <w:u w:color="0000FF"/>
           </w:rPrChange>
         </w:rPr>
@@ -10224,7 +10224,7 @@
         <w:t xml:space="preserve"> </w:t>
         <w:t>14.7.1</w:t>
       </w:r>
-      <w:ins w:id="120" w:author="AtomizerTest" w:date="2026-02-20T03:04:20Z">
+      <w:ins w:id="120" w:author="AtomizerTest" w:date="2026-02-21T02:16:04Z">
         <w:r>
           <w:t xml:space="preserve"> or Section </w:t>
           <w:fldChar w:fldCharType="begin"/>
@@ -10236,7 +10236,7 @@
       </w:ins>
       <w:r>
         <w:rPr>
-          <w:rPrChange w:id="121" w:author="AtomizerTest" w:date="2026-02-20T03:04:20Z">
+          <w:rPrChange w:id="121" w:author="AtomizerTest" w:date="2026-02-21T02:16:04Z">
             <w:u w:color="0000FF"/>
           </w:rPrChange>
         </w:rPr>
@@ -10244,7 +10244,7 @@
         <w:t xml:space="preserve"> </w:t>
         <w:t>such</w:t>
       </w:r>
-      <w:del w:id="122" w:author="AtomizerTest" w:date="2026-02-20T03:04:20Z">
+      <w:del w:id="122" w:author="AtomizerTest" w:date="2026-02-21T02:16:04Z">
         <w:r>
           <w:rPr>
             <w:u w:color="0000FF"/>
@@ -10252,14 +10252,14 @@
           <w:delText xml:space="preserve"> </w:delText>
         </w:r>
       </w:del>
-      <w:ins w:id="123" w:author="AtomizerTest" w:date="2026-02-20T03:04:20Z">
+      <w:ins w:id="123" w:author="AtomizerTest" w:date="2026-02-21T02:16:04Z">
         <w:r>
           <w:t xml:space="preserve">  </w:t>
         </w:r>
       </w:ins>
       <w:r>
         <w:rPr>
-          <w:rPrChange w:id="124" w:author="AtomizerTest" w:date="2026-02-20T03:04:20Z">
+          <w:rPrChange w:id="124" w:author="AtomizerTest" w:date="2026-02-21T02:16:04Z">
             <w:u w:color="0000FF"/>
           </w:rPrChange>
         </w:rPr>
@@ -10368,7 +10368,7 @@
         <w:t>its</w:t>
         <w:t xml:space="preserve"> </w:t>
       </w:r>
-      <w:del w:id="125" w:author="AtomizerTest" w:date="2026-02-20T03:04:20Z">
+      <w:del w:id="125" w:author="AtomizerTest" w:date="2026-02-21T02:16:04Z">
         <w:r>
           <w:rPr>
             <w:u w:color="0000FF"/>
@@ -10376,14 +10376,14 @@
           <w:delText>obligation</w:delText>
         </w:r>
       </w:del>
-      <w:ins w:id="126" w:author="AtomizerTest" w:date="2026-02-20T03:04:20Z">
+      <w:ins w:id="126" w:author="AtomizerTest" w:date="2026-02-21T02:16:04Z">
         <w:r>
           <w:t>obligations</w:t>
         </w:r>
       </w:ins>
       <w:r>
         <w:rPr>
-          <w:rPrChange w:id="127" w:author="AtomizerTest" w:date="2026-02-20T03:04:20Z">
+          <w:rPrChange w:id="127" w:author="AtomizerTest" w:date="2026-02-21T02:16:04Z">
             <w:u w:color="0000FF"/>
           </w:rPrChange>
         </w:rPr>
@@ -10394,7 +10394,7 @@
         <w:t xml:space="preserve"> </w:t>
         <w:t>14.7.1</w:t>
       </w:r>
-      <w:ins w:id="128" w:author="AtomizerTest" w:date="2026-02-20T03:04:20Z">
+      <w:ins w:id="128" w:author="AtomizerTest" w:date="2026-02-21T02:16:04Z">
         <w:r>
           <w:t xml:space="preserve"> or Section </w:t>
           <w:fldChar w:fldCharType="begin"/>
@@ -10406,7 +10406,7 @@
       </w:ins>
       <w:r>
         <w:rPr>
-          <w:rPrChange w:id="129" w:author="AtomizerTest" w:date="2026-02-20T03:04:20Z">
+          <w:rPrChange w:id="129" w:author="AtomizerTest" w:date="2026-02-21T02:16:04Z">
             <w:u w:color="0000FF"/>
           </w:rPrChange>
         </w:rPr>
@@ -10473,7 +10473,7 @@
         <w:t>Section</w:t>
         <w:t xml:space="preserve"> </w:t>
       </w:r>
-      <w:del w:id="130" w:author="AtomizerTest" w:date="2026-02-20T03:04:20Z">
+      <w:del w:id="130" w:author="AtomizerTest" w:date="2026-02-21T02:16:04Z">
         <w:r>
           <w:rPr>
             <w:u w:color="0000FF"/>
@@ -10485,7 +10485,7 @@
           <w:fldChar w:fldCharType="end"/>
         </w:r>
       </w:del>
-      <w:ins w:id="131" w:author="AtomizerTest" w:date="2026-02-20T03:04:20Z">
+      <w:ins w:id="131" w:author="AtomizerTest" w:date="2026-02-21T02:16:04Z">
         <w:r>
           <w:fldChar w:fldCharType="begin"/>
           <w:instrText xml:space="preserve"> REF _Ref40095031 \r \h </w:instrText>
@@ -10496,7 +10496,7 @@
       </w:ins>
       <w:r>
         <w:rPr>
-          <w:rPrChange w:id="132" w:author="AtomizerTest" w:date="2026-02-20T03:04:20Z">
+          <w:rPrChange w:id="132" w:author="AtomizerTest" w:date="2026-02-21T02:16:04Z">
             <w:u w:color="0000FF"/>
           </w:rPrChange>
         </w:rPr>
@@ -10523,7 +10523,7 @@
         <w:t xml:space="preserve"> </w:t>
         <w:t>14.7.1</w:t>
       </w:r>
-      <w:del w:id="133" w:author="AtomizerTest" w:date="2026-02-20T03:04:20Z">
+      <w:del w:id="133" w:author="AtomizerTest" w:date="2026-02-21T02:16:04Z">
         <w:r>
           <w:rPr>
             <w:u w:color="0000FF"/>
@@ -10531,7 +10531,7 @@
           <w:delText>.</w:delText>
         </w:r>
       </w:del>
-      <w:ins w:id="134" w:author="AtomizerTest" w:date="2026-02-20T03:04:20Z">
+      <w:ins w:id="134" w:author="AtomizerTest" w:date="2026-02-21T02:16:04Z">
         <w:r>
           <w:t xml:space="preserve"> or Section </w:t>
           <w:fldChar w:fldCharType="begin"/>
@@ -10545,7 +10545,7 @@
       <w:r>
         <w:rPr>
           <w:rStyle w:val="FootnoteReference"/>
-          <w:rPrChange w:id="135" w:author="AtomizerTest" w:date="2026-02-20T03:04:20Z">
+          <w:rPrChange w:id="135" w:author="AtomizerTest" w:date="2026-02-21T02:16:04Z">
             <w:rStyle w:val="FootnoteReference"/>
             <w:u w:color="0000FF"/>
           </w:rPrChange>
@@ -10561,12 +10561,12 @@
         </w:tabs>
         <w:ind w:left="0" w:firstLine="720"/>
       </w:pPr>
-      <w:del w:id="136" w:author="AtomizerTest" w:date="2026-02-20T03:04:20Z">
+      <w:del w:id="136" w:author="AtomizerTest" w:date="2026-02-21T02:16:04Z">
         <w:r>
           <w:tab/>
         </w:r>
       </w:del>
-      <w:ins w:id="137" w:author="AtomizerTest" w:date="2026-02-20T03:04:20Z">
+      <w:ins w:id="137" w:author="AtomizerTest" w:date="2026-02-21T02:16:04Z">
         <w:r>
           <w:tab/>
         </w:r>
@@ -10914,7 +10914,7 @@
         <w:fldChar w:fldCharType="end"/>
         <w:t xml:space="preserve"> (Right of Set Off) shall be without prejudice to any other rights or remedies available to the Fund under this Agreement or otherwise.</w:t>
       </w:r>
-      <w:del w:id="138" w:author="AtomizerTest" w:date="2026-02-20T03:04:20Z">
+      <w:del w:id="138" w:author="AtomizerTest" w:date="2026-02-21T02:16:04Z">
         <w:r>
           <w:delText xml:space="preserve">  </w:delText>
         </w:r>
@@ -10983,7 +10983,7 @@
         <w:tab/>
         <w:t>within ninety (90) days after the end of each Fiscal Year (commencing after December 31 of the Fiscal Year of the Initial Closing Date), a financial report audited by the Auditor as of the end of such Fiscal Year, prepared in compliance with GAAP, which shall include, among other things, (i) the audited financial statements of the Fund, (ii) confirmation that the amounts of Management Fee and Carried Interest that have been distributed, the amount of Carried Interest retained in the Escrow Account pursuant to Section </w:t>
       </w:r>
-      <w:del w:id="139" w:author="AtomizerTest" w:date="2026-02-20T03:04:20Z">
+      <w:del w:id="139" w:author="AtomizerTest" w:date="2026-02-21T02:16:04Z">
         <w:r>
           <w:fldChar w:fldCharType="begin"/>
           <w:instrText xml:space="preserve"> REF _Ref18675847 \r \h </w:instrText>
@@ -10992,7 +10992,7 @@
           <w:fldChar w:fldCharType="end"/>
         </w:r>
       </w:del>
-      <w:ins w:id="140" w:author="AtomizerTest" w:date="2026-02-20T03:04:20Z">
+      <w:ins w:id="140" w:author="AtomizerTest" w:date="2026-02-21T02:16:04Z">
         <w:r>
           <w:fldChar w:fldCharType="begin"/>
           <w:instrText xml:space="preserve"> REF _Ref40094595 \r \h </w:instrText>
@@ -11587,12 +11587,12 @@
         </w:tabs>
         <w:ind w:firstLine="0"/>
       </w:pPr>
-      <w:del w:id="141" w:author="AtomizerTest" w:date="2026-02-20T03:04:20Z">
+      <w:del w:id="141" w:author="AtomizerTest" w:date="2026-02-21T02:16:04Z">
         <w:r>
           <w:tab/>
         </w:r>
       </w:del>
-      <w:ins w:id="142" w:author="AtomizerTest" w:date="2026-02-20T03:04:20Z">
+      <w:ins w:id="142" w:author="AtomizerTest" w:date="2026-02-21T02:16:04Z">
         <w:r>
           <w:tab/>
         </w:r>
@@ -11615,7 +11615,7 @@
       <w:r>
         <w:tab/>
       </w:r>
-      <w:del w:id="143" w:author="AtomizerTest" w:date="2026-02-20T03:04:20Z">
+      <w:del w:id="143" w:author="AtomizerTest" w:date="2026-02-21T02:16:04Z">
         <w:r>
           <w:tab/>
         </w:r>
@@ -11633,13 +11633,13 @@
         </w:tabs>
         <w:ind w:left="0" w:firstLine="576"/>
       </w:pPr>
-      <w:del w:id="144" w:author="AtomizerTest" w:date="2026-02-20T03:04:20Z">
+      <w:del w:id="144" w:author="AtomizerTest" w:date="2026-02-21T02:16:04Z">
         <w:r>
           <w:tab/>
           <w:tab/>
         </w:r>
       </w:del>
-      <w:ins w:id="145" w:author="AtomizerTest" w:date="2026-02-20T03:04:20Z">
+      <w:ins w:id="145" w:author="AtomizerTest" w:date="2026-02-21T02:16:04Z">
         <w:r>
           <w:tab/>
         </w:r>
@@ -13581,7 +13581,7 @@
           <w:spacing w:val="-3"/>
           <w:szCs w:val="22"/>
           <w:lang w:eastAsia="en-GB"/>
-          <w:rPrChange w:id="146" w:author="AtomizerTest" w:date="2026-02-20T03:04:20Z">
+          <w:rPrChange w:id="146" w:author="AtomizerTest" w:date="2026-02-21T02:16:04Z">
             <w:rStyle w:val="FootnoteReference"/>
             <w:color w:val="000000"/>
             <w:szCs w:val="22"/>

</xml_diff>

<commit_message>
feat: checkpoint allure readability upgrades and comment tooling
</commit_message>
<xml_diff>
--- a/packages/docx-comparison/src/testing/outputs/atomizer_redline.docx
+++ b/packages/docx-comparison/src/testing/outputs/atomizer_redline.docx
@@ -129,7 +129,7 @@
         </w:rPr>
         <w:t xml:space="preserve">The ILPA Model Limited Partnership Agreement </w:t>
       </w:r>
-      <w:del w:id="1" w:author="AtomizerTest" w:date="2026-02-21T02:16:04Z">
+      <w:del w:id="1" w:author="AtomizerTest" w:date="2026-02-21T18:24:09Z">
         <w:r>
           <w:rPr>
             <w:b/>
@@ -139,7 +139,7 @@
           <w:delText>(Whole-of-Fund</w:delText>
         </w:r>
       </w:del>
-      <w:ins w:id="2" w:author="AtomizerTest" w:date="2026-02-21T02:16:04Z">
+      <w:ins w:id="2" w:author="AtomizerTest" w:date="2026-02-21T18:24:09Z">
         <w:r>
           <w:rPr>
             <w:b/>
@@ -166,11 +166,11 @@
         <w:spacing w:after="240"/>
         <w:jc w:val="center"/>
         <w:rPr>
-          <w:del w:id="3" w:author="AtomizerTest" w:date="2026-02-21T02:16:04Z"/>
+          <w:del w:id="3" w:author="AtomizerTest" w:date="2026-02-21T18:24:09Z"/>
           <w:bCs/>
         </w:rPr>
       </w:pPr>
-      <w:del w:id="4" w:author="AtomizerTest" w:date="2026-02-21T02:16:04Z">
+      <w:del w:id="4" w:author="AtomizerTest" w:date="2026-02-21T18:24:09Z">
         <w:r>
           <w:rPr>
             <w:b/>
@@ -181,7 +181,7 @@
         </w:r>
       </w:del>
     </w:p>
-    <w:del w:id="5" w:author="AtomizerTest" w:date="2026-02-21T02:16:04Z">
+    <w:del w:id="5" w:author="AtomizerTest" w:date="2026-02-21T18:24:09Z">
       <w:p>
         <w:pPr>
           <w:autoSpaceDE w:val="0"/>
@@ -203,11 +203,11 @@
         <w:spacing w:after="240"/>
         <w:jc w:val="center"/>
         <w:rPr>
-          <w:ins w:id="6" w:author="AtomizerTest" w:date="2026-02-21T02:16:04Z"/>
+          <w:ins w:id="6" w:author="AtomizerTest" w:date="2026-02-21T18:24:09Z"/>
           <w:bCs/>
         </w:rPr>
       </w:pPr>
-      <w:ins w:id="7" w:author="AtomizerTest" w:date="2026-02-21T02:16:04Z">
+      <w:ins w:id="7" w:author="AtomizerTest" w:date="2026-02-21T18:24:09Z">
         <w:r>
           <w:rPr>
             <w:b/>
@@ -218,7 +218,7 @@
         </w:r>
       </w:ins>
     </w:p>
-    <w:ins w:id="8" w:author="AtomizerTest" w:date="2026-02-21T02:16:04Z">
+    <w:ins w:id="8" w:author="AtomizerTest" w:date="2026-02-21T18:24:09Z">
       <w:p>
         <w:pPr>
           <w:autoSpaceDE w:val="0"/>
@@ -770,7 +770,7 @@
         <w:instrText xml:space="preserve"> PAGEREF _Toc2094293 \h </w:instrText>
         <w:fldChar w:fldCharType="separate"/>
       </w:r>
-      <w:del w:id="9" w:author="AtomizerTest" w:date="2026-02-21T02:16:04Z">
+      <w:del w:id="9" w:author="AtomizerTest" w:date="2026-02-21T18:24:09Z">
         <w:r>
           <w:rPr>
             <w:noProof/>
@@ -779,7 +779,7 @@
           <w:fldChar w:fldCharType="end"/>
         </w:r>
       </w:del>
-      <w:ins w:id="10" w:author="AtomizerTest" w:date="2026-02-21T02:16:04Z">
+      <w:ins w:id="10" w:author="AtomizerTest" w:date="2026-02-21T18:24:09Z">
         <w:r>
           <w:rPr>
             <w:noProof/>
@@ -812,7 +812,7 @@
         <w:instrText xml:space="preserve"> PAGEREF _Toc2094294 \h </w:instrText>
         <w:fldChar w:fldCharType="separate"/>
       </w:r>
-      <w:del w:id="11" w:author="AtomizerTest" w:date="2026-02-21T02:16:04Z">
+      <w:del w:id="11" w:author="AtomizerTest" w:date="2026-02-21T18:24:09Z">
         <w:r>
           <w:rPr>
             <w:noProof/>
@@ -821,7 +821,7 @@
           <w:fldChar w:fldCharType="end"/>
         </w:r>
       </w:del>
-      <w:ins w:id="12" w:author="AtomizerTest" w:date="2026-02-21T02:16:04Z">
+      <w:ins w:id="12" w:author="AtomizerTest" w:date="2026-02-21T18:24:09Z">
         <w:r>
           <w:rPr>
             <w:noProof/>
@@ -854,7 +854,7 @@
         <w:instrText xml:space="preserve"> PAGEREF _Toc2094295 \h </w:instrText>
         <w:fldChar w:fldCharType="separate"/>
       </w:r>
-      <w:del w:id="13" w:author="AtomizerTest" w:date="2026-02-21T02:16:04Z">
+      <w:del w:id="13" w:author="AtomizerTest" w:date="2026-02-21T18:24:09Z">
         <w:r>
           <w:rPr>
             <w:noProof/>
@@ -863,7 +863,7 @@
           <w:fldChar w:fldCharType="end"/>
         </w:r>
       </w:del>
-      <w:ins w:id="14" w:author="AtomizerTest" w:date="2026-02-21T02:16:04Z">
+      <w:ins w:id="14" w:author="AtomizerTest" w:date="2026-02-21T18:24:09Z">
         <w:r>
           <w:rPr>
             <w:noProof/>
@@ -896,7 +896,7 @@
         <w:instrText xml:space="preserve"> PAGEREF _Toc2094296 \h </w:instrText>
         <w:fldChar w:fldCharType="separate"/>
       </w:r>
-      <w:del w:id="15" w:author="AtomizerTest" w:date="2026-02-21T02:16:04Z">
+      <w:del w:id="15" w:author="AtomizerTest" w:date="2026-02-21T18:24:09Z">
         <w:r>
           <w:rPr>
             <w:noProof/>
@@ -905,7 +905,7 @@
           <w:fldChar w:fldCharType="end"/>
         </w:r>
       </w:del>
-      <w:ins w:id="16" w:author="AtomizerTest" w:date="2026-02-21T02:16:04Z">
+      <w:ins w:id="16" w:author="AtomizerTest" w:date="2026-02-21T18:24:09Z">
         <w:r>
           <w:rPr>
             <w:noProof/>
@@ -936,7 +936,7 @@
         <w:tab/>
         <w:fldChar w:fldCharType="begin"/>
       </w:r>
-      <w:del w:id="17" w:author="AtomizerTest" w:date="2026-02-21T02:16:04Z">
+      <w:del w:id="17" w:author="AtomizerTest" w:date="2026-02-21T18:24:09Z">
         <w:r>
           <w:rPr>
             <w:noProof/>
@@ -947,7 +947,7 @@
           <w:fldChar w:fldCharType="end"/>
         </w:r>
       </w:del>
-      <w:ins w:id="18" w:author="AtomizerTest" w:date="2026-02-21T02:16:04Z">
+      <w:ins w:id="18" w:author="AtomizerTest" w:date="2026-02-21T18:24:09Z">
         <w:r>
           <w:rPr>
             <w:noProof/>
@@ -983,7 +983,7 @@
         <w:instrText xml:space="preserve"> PAGEREF _Toc2094298 \h </w:instrText>
         <w:fldChar w:fldCharType="separate"/>
       </w:r>
-      <w:del w:id="19" w:author="AtomizerTest" w:date="2026-02-21T02:16:04Z">
+      <w:del w:id="19" w:author="AtomizerTest" w:date="2026-02-21T18:24:09Z">
         <w:r>
           <w:rPr>
             <w:noProof/>
@@ -992,7 +992,7 @@
           <w:fldChar w:fldCharType="end"/>
         </w:r>
       </w:del>
-      <w:ins w:id="20" w:author="AtomizerTest" w:date="2026-02-21T02:16:04Z">
+      <w:ins w:id="20" w:author="AtomizerTest" w:date="2026-02-21T18:24:09Z">
         <w:r>
           <w:rPr>
             <w:noProof/>
@@ -1025,7 +1025,7 @@
         <w:instrText xml:space="preserve"> PAGEREF _Toc2094299 \h </w:instrText>
         <w:fldChar w:fldCharType="separate"/>
       </w:r>
-      <w:del w:id="21" w:author="AtomizerTest" w:date="2026-02-21T02:16:04Z">
+      <w:del w:id="21" w:author="AtomizerTest" w:date="2026-02-21T18:24:09Z">
         <w:r>
           <w:rPr>
             <w:noProof/>
@@ -1034,7 +1034,7 @@
           <w:fldChar w:fldCharType="end"/>
         </w:r>
       </w:del>
-      <w:ins w:id="22" w:author="AtomizerTest" w:date="2026-02-21T02:16:04Z">
+      <w:ins w:id="22" w:author="AtomizerTest" w:date="2026-02-21T18:24:09Z">
         <w:r>
           <w:rPr>
             <w:noProof/>
@@ -1067,7 +1067,7 @@
         <w:instrText xml:space="preserve"> PAGEREF _Toc2094300 \h </w:instrText>
         <w:fldChar w:fldCharType="separate"/>
       </w:r>
-      <w:del w:id="23" w:author="AtomizerTest" w:date="2026-02-21T02:16:04Z">
+      <w:del w:id="23" w:author="AtomizerTest" w:date="2026-02-21T18:24:09Z">
         <w:r>
           <w:rPr>
             <w:noProof/>
@@ -1076,7 +1076,7 @@
           <w:fldChar w:fldCharType="end"/>
         </w:r>
       </w:del>
-      <w:ins w:id="24" w:author="AtomizerTest" w:date="2026-02-21T02:16:04Z">
+      <w:ins w:id="24" w:author="AtomizerTest" w:date="2026-02-21T18:24:09Z">
         <w:r>
           <w:rPr>
             <w:noProof/>
@@ -1107,7 +1107,7 @@
         <w:tab/>
         <w:fldChar w:fldCharType="begin"/>
       </w:r>
-      <w:del w:id="25" w:author="AtomizerTest" w:date="2026-02-21T02:16:04Z">
+      <w:del w:id="25" w:author="AtomizerTest" w:date="2026-02-21T18:24:09Z">
         <w:r>
           <w:rPr>
             <w:noProof/>
@@ -1116,7 +1116,7 @@
           <w:instrText xml:space="preserve">094301 \h </w:instrText>
         </w:r>
       </w:del>
-      <w:ins w:id="26" w:author="AtomizerTest" w:date="2026-02-21T02:16:04Z">
+      <w:ins w:id="26" w:author="AtomizerTest" w:date="2026-02-21T18:24:09Z">
         <w:r>
           <w:rPr>
             <w:noProof/>
@@ -1156,7 +1156,7 @@
         <w:instrText xml:space="preserve"> PAGEREF _Toc2094302 \h </w:instrText>
         <w:fldChar w:fldCharType="separate"/>
       </w:r>
-      <w:del w:id="27" w:author="AtomizerTest" w:date="2026-02-21T02:16:04Z">
+      <w:del w:id="27" w:author="AtomizerTest" w:date="2026-02-21T18:24:09Z">
         <w:r>
           <w:rPr>
             <w:noProof/>
@@ -1165,7 +1165,7 @@
           <w:fldChar w:fldCharType="end"/>
         </w:r>
       </w:del>
-      <w:ins w:id="28" w:author="AtomizerTest" w:date="2026-02-21T02:16:04Z">
+      <w:ins w:id="28" w:author="AtomizerTest" w:date="2026-02-21T18:24:09Z">
         <w:r>
           <w:rPr>
             <w:noProof/>
@@ -1224,7 +1224,7 @@
         <w:instrText xml:space="preserve"> PAGEREF _Toc2094304 \h </w:instrText>
         <w:fldChar w:fldCharType="separate"/>
       </w:r>
-      <w:del w:id="29" w:author="AtomizerTest" w:date="2026-02-21T02:16:04Z">
+      <w:del w:id="29" w:author="AtomizerTest" w:date="2026-02-21T18:24:09Z">
         <w:r>
           <w:rPr>
             <w:noProof/>
@@ -1233,7 +1233,7 @@
           <w:fldChar w:fldCharType="end"/>
         </w:r>
       </w:del>
-      <w:ins w:id="30" w:author="AtomizerTest" w:date="2026-02-21T02:16:04Z">
+      <w:ins w:id="30" w:author="AtomizerTest" w:date="2026-02-21T18:24:09Z">
         <w:r>
           <w:rPr>
             <w:noProof/>
@@ -1266,7 +1266,7 @@
         <w:instrText xml:space="preserve"> PAGEREF _Toc2094305 \h </w:instrText>
         <w:fldChar w:fldCharType="separate"/>
       </w:r>
-      <w:del w:id="31" w:author="AtomizerTest" w:date="2026-02-21T02:16:04Z">
+      <w:del w:id="31" w:author="AtomizerTest" w:date="2026-02-21T18:24:09Z">
         <w:r>
           <w:rPr>
             <w:noProof/>
@@ -1275,7 +1275,7 @@
           <w:fldChar w:fldCharType="end"/>
         </w:r>
       </w:del>
-      <w:ins w:id="32" w:author="AtomizerTest" w:date="2026-02-21T02:16:04Z">
+      <w:ins w:id="32" w:author="AtomizerTest" w:date="2026-02-21T18:24:09Z">
         <w:r>
           <w:rPr>
             <w:noProof/>
@@ -1306,7 +1306,7 @@
         <w:tab/>
         <w:fldChar w:fldCharType="begin"/>
       </w:r>
-      <w:del w:id="33" w:author="AtomizerTest" w:date="2026-02-21T02:16:04Z">
+      <w:del w:id="33" w:author="AtomizerTest" w:date="2026-02-21T18:24:09Z">
         <w:r>
           <w:rPr>
             <w:noProof/>
@@ -1317,7 +1317,7 @@
           <w:fldChar w:fldCharType="end"/>
         </w:r>
       </w:del>
-      <w:ins w:id="34" w:author="AtomizerTest" w:date="2026-02-21T02:16:04Z">
+      <w:ins w:id="34" w:author="AtomizerTest" w:date="2026-02-21T18:24:09Z">
         <w:r>
           <w:rPr>
             <w:noProof/>
@@ -1351,7 +1351,7 @@
         <w:tab/>
         <w:fldChar w:fldCharType="begin"/>
       </w:r>
-      <w:del w:id="35" w:author="AtomizerTest" w:date="2026-02-21T02:16:04Z">
+      <w:del w:id="35" w:author="AtomizerTest" w:date="2026-02-21T18:24:09Z">
         <w:r>
           <w:rPr>
             <w:noProof/>
@@ -1363,7 +1363,7 @@
           <w:fldChar w:fldCharType="end"/>
         </w:r>
       </w:del>
-      <w:ins w:id="36" w:author="AtomizerTest" w:date="2026-02-21T02:16:04Z">
+      <w:ins w:id="36" w:author="AtomizerTest" w:date="2026-02-21T18:24:09Z">
         <w:r>
           <w:rPr>
             <w:noProof/>
@@ -1398,7 +1398,7 @@
         <w:instrText xml:space="preserve"> PAGEREF _Toc2094308 \h </w:instrText>
         <w:fldChar w:fldCharType="separate"/>
       </w:r>
-      <w:del w:id="37" w:author="AtomizerTest" w:date="2026-02-21T02:16:04Z">
+      <w:del w:id="37" w:author="AtomizerTest" w:date="2026-02-21T18:24:09Z">
         <w:r>
           <w:rPr>
             <w:noProof/>
@@ -1407,7 +1407,7 @@
           <w:fldChar w:fldCharType="end"/>
         </w:r>
       </w:del>
-      <w:ins w:id="38" w:author="AtomizerTest" w:date="2026-02-21T02:16:04Z">
+      <w:ins w:id="38" w:author="AtomizerTest" w:date="2026-02-21T18:24:09Z">
         <w:r>
           <w:rPr>
             <w:noProof/>
@@ -1466,7 +1466,7 @@
         <w:instrText xml:space="preserve"> PAGEREF _Toc2094310 \h </w:instrText>
         <w:fldChar w:fldCharType="separate"/>
       </w:r>
-      <w:del w:id="39" w:author="AtomizerTest" w:date="2026-02-21T02:16:04Z">
+      <w:del w:id="39" w:author="AtomizerTest" w:date="2026-02-21T18:24:09Z">
         <w:r>
           <w:rPr>
             <w:noProof/>
@@ -1475,7 +1475,7 @@
           <w:fldChar w:fldCharType="end"/>
         </w:r>
       </w:del>
-      <w:ins w:id="40" w:author="AtomizerTest" w:date="2026-02-21T02:16:04Z">
+      <w:ins w:id="40" w:author="AtomizerTest" w:date="2026-02-21T18:24:09Z">
         <w:r>
           <w:rPr>
             <w:noProof/>
@@ -1532,7 +1532,7 @@
         <w:tab/>
         <w:fldChar w:fldCharType="begin"/>
       </w:r>
-      <w:del w:id="41" w:author="AtomizerTest" w:date="2026-02-21T02:16:04Z">
+      <w:del w:id="41" w:author="AtomizerTest" w:date="2026-02-21T18:24:09Z">
         <w:r>
           <w:rPr>
             <w:noProof/>
@@ -1543,7 +1543,7 @@
           <w:fldChar w:fldCharType="end"/>
         </w:r>
       </w:del>
-      <w:ins w:id="42" w:author="AtomizerTest" w:date="2026-02-21T02:16:04Z">
+      <w:ins w:id="42" w:author="AtomizerTest" w:date="2026-02-21T18:24:09Z">
         <w:r>
           <w:rPr>
             <w:noProof/>
@@ -2169,10 +2169,10 @@
       <w:pPr>
         <w:pStyle w:val="BodyText"/>
         <w:rPr>
-          <w:ins w:id="43" w:author="AtomizerTest" w:date="2026-02-21T02:16:04Z"/>
-        </w:rPr>
-      </w:pPr>
-      <w:ins w:id="44" w:author="AtomizerTest" w:date="2026-02-21T02:16:04Z">
+          <w:ins w:id="43" w:author="AtomizerTest" w:date="2026-02-21T18:24:09Z"/>
+        </w:rPr>
+      </w:pPr>
+      <w:ins w:id="44" w:author="AtomizerTest" w:date="2026-02-21T18:24:09Z">
         <w:r>
           <w:t xml:space="preserve">“Disposition” means the sale, exchange, redemption, maturity, or other disposition by the Fund of all or a portion of a Portfolio Investment, including distributions in kind to the Partners.  For all purposes of this Agreement, an extraordinary dividend, refinancing, capital restructuring or similar transaction or distribution in connection with a Portfolio Investment shall be considered a “Disposition”.</w:t>
         </w:r>
@@ -2185,12 +2185,12 @@
       <w:r>
         <w:t>“Distributable Proceeds” means, as of any date, the excess of (i) the cash received by the Fund from any</w:t>
       </w:r>
-      <w:del w:id="45" w:author="AtomizerTest" w:date="2026-02-21T02:16:04Z">
+      <w:del w:id="45" w:author="AtomizerTest" w:date="2026-02-21T18:24:09Z">
         <w:r>
           <w:delText xml:space="preserve"> sale or other disposition</w:delText>
         </w:r>
       </w:del>
-      <w:ins w:id="46" w:author="AtomizerTest" w:date="2026-02-21T02:16:04Z">
+      <w:ins w:id="46" w:author="AtomizerTest" w:date="2026-02-21T18:24:09Z">
         <w:r>
           <w:t xml:space="preserve"> Disposition</w:t>
         </w:r>
@@ -2293,7 +2293,7 @@
       <w:r>
         <w:t xml:space="preserve">“Escrow Account” has the meaning set forth in Section </w:t>
       </w:r>
-      <w:del w:id="47" w:author="AtomizerTest" w:date="2026-02-21T02:16:04Z">
+      <w:del w:id="47" w:author="AtomizerTest" w:date="2026-02-21T18:24:09Z">
         <w:r>
           <w:fldChar w:fldCharType="begin"/>
           <w:instrText xml:space="preserve"> REF _Ref18675847 \r \h </w:instrText>
@@ -2302,7 +2302,7 @@
           <w:fldChar w:fldCharType="end"/>
         </w:r>
       </w:del>
-      <w:ins w:id="48" w:author="AtomizerTest" w:date="2026-02-21T02:16:04Z">
+      <w:ins w:id="48" w:author="AtomizerTest" w:date="2026-02-21T18:24:09Z">
         <w:r>
           <w:fldChar w:fldCharType="begin"/>
           <w:instrText xml:space="preserve"> REF _Ref34603774 \r \h </w:instrText>
@@ -2758,10 +2758,10 @@
       <w:pPr>
         <w:pStyle w:val="BodyText"/>
         <w:rPr>
-          <w:ins w:id="49" w:author="AtomizerTest" w:date="2026-02-21T02:16:04Z"/>
-        </w:rPr>
-      </w:pPr>
-      <w:ins w:id="50" w:author="AtomizerTest" w:date="2026-02-21T02:16:04Z">
+          <w:ins w:id="49" w:author="AtomizerTest" w:date="2026-02-21T18:24:09Z"/>
+        </w:rPr>
+      </w:pPr>
+      <w:ins w:id="50" w:author="AtomizerTest" w:date="2026-02-21T18:24:09Z">
         <w:r>
           <w:t xml:space="preserve">“Interim Clawback Amount” has the meaning set forth in Section </w:t>
           <w:fldChar w:fldCharType="begin"/>
@@ -2777,10 +2777,10 @@
       <w:pPr>
         <w:pStyle w:val="BodyText"/>
         <w:rPr>
-          <w:ins w:id="51" w:author="AtomizerTest" w:date="2026-02-21T02:16:04Z"/>
-        </w:rPr>
-      </w:pPr>
-      <w:ins w:id="52" w:author="AtomizerTest" w:date="2026-02-21T02:16:04Z">
+          <w:ins w:id="51" w:author="AtomizerTest" w:date="2026-02-21T18:24:09Z"/>
+        </w:rPr>
+      </w:pPr>
+      <w:ins w:id="52" w:author="AtomizerTest" w:date="2026-02-21T18:24:09Z">
         <w:r>
           <w:t xml:space="preserve">“Interim Clawback Date” has the meaning set forth in Section </w:t>
           <w:fldChar w:fldCharType="begin"/>
@@ -2796,10 +2796,10 @@
       <w:pPr>
         <w:pStyle w:val="BodyText"/>
         <w:rPr>
-          <w:ins w:id="53" w:author="AtomizerTest" w:date="2026-02-21T02:16:04Z"/>
-        </w:rPr>
-      </w:pPr>
-      <w:ins w:id="54" w:author="AtomizerTest" w:date="2026-02-21T02:16:04Z">
+          <w:ins w:id="53" w:author="AtomizerTest" w:date="2026-02-21T18:24:09Z"/>
+        </w:rPr>
+      </w:pPr>
+      <w:ins w:id="54" w:author="AtomizerTest" w:date="2026-02-21T18:24:09Z">
         <w:r>
           <w:t xml:space="preserve">“Interim Clawback Obligation” has the meaning set forth in Section </w:t>
           <w:fldChar w:fldCharType="begin"/>
@@ -3048,12 +3048,12 @@
       <w:r>
         <w:t>“Non-Defaulting Partners” has the meaning set forth in Section </w:t>
       </w:r>
-      <w:del w:id="55" w:author="AtomizerTest" w:date="2026-02-21T02:16:04Z">
+      <w:del w:id="55" w:author="AtomizerTest" w:date="2026-02-21T18:24:09Z">
         <w:r>
           <w:delText>6.6.3.</w:delText>
         </w:r>
       </w:del>
-      <w:ins w:id="56" w:author="AtomizerTest" w:date="2026-02-21T02:16:04Z">
+      <w:ins w:id="56" w:author="AtomizerTest" w:date="2026-02-21T18:24:09Z">
         <w:r>
           <w:fldChar w:fldCharType="begin"/>
           <w:instrText xml:space="preserve"> REF _Ref18679391 \r \h </w:instrText>
@@ -3250,12 +3250,12 @@
       <w:r>
         <w:t xml:space="preserve">“Preferred Return” means, with respect to each Partner (other than an Affiliated Partner), as of any date of determination, such amount as is equal to an annual rate of return of [8]%, compounded annually and calculated daily on the Capital Contributions made by such Limited </w:t>
       </w:r>
-      <w:del w:id="57" w:author="AtomizerTest" w:date="2026-02-21T02:16:04Z">
+      <w:del w:id="57" w:author="AtomizerTest" w:date="2026-02-21T18:24:09Z">
         <w:r>
           <w:delText>Partner,</w:delText>
         </w:r>
       </w:del>
-      <w:ins w:id="58" w:author="AtomizerTest" w:date="2026-02-21T02:16:04Z">
+      <w:ins w:id="58" w:author="AtomizerTest" w:date="2026-02-21T18:24:09Z">
         <w:r>
           <w:t xml:space="preserve">Partner described in Section </w:t>
           <w:fldChar w:fldCharType="begin"/>
@@ -3325,10 +3325,10 @@
       <w:pPr>
         <w:pStyle w:val="BodyText"/>
         <w:rPr>
-          <w:ins w:id="59" w:author="AtomizerTest" w:date="2026-02-21T02:16:04Z"/>
-        </w:rPr>
-      </w:pPr>
-      <w:ins w:id="60" w:author="AtomizerTest" w:date="2026-02-21T02:16:04Z">
+          <w:ins w:id="59" w:author="AtomizerTest" w:date="2026-02-21T18:24:09Z"/>
+        </w:rPr>
+      </w:pPr>
+      <w:ins w:id="60" w:author="AtomizerTest" w:date="2026-02-21T18:24:09Z">
         <w:r>
           <w:t>“Realized Investment” means, as of any date of determination, each Portfolio Investment (other than Temporary Investments) that has been the subject of a Disposition.</w:t>
         </w:r>
@@ -3817,10 +3817,10 @@
       <w:pPr>
         <w:pStyle w:val="BodyText"/>
         <w:rPr>
-          <w:ins w:id="61" w:author="AtomizerTest" w:date="2026-02-21T02:16:04Z"/>
-        </w:rPr>
-      </w:pPr>
-      <w:ins w:id="62" w:author="AtomizerTest" w:date="2026-02-21T02:16:04Z">
+          <w:ins w:id="61" w:author="AtomizerTest" w:date="2026-02-21T18:24:09Z"/>
+        </w:rPr>
+      </w:pPr>
+      <w:ins w:id="62" w:author="AtomizerTest" w:date="2026-02-21T18:24:09Z">
         <w:r>
           <w:t>“Unrealized Investment” means each Portfolio Investment other than Temporary Investments and Realized Investments.</w:t>
         </w:r>
@@ -3830,10 +3830,10 @@
       <w:pPr>
         <w:pStyle w:val="BodyText"/>
         <w:rPr>
-          <w:ins w:id="63" w:author="AtomizerTest" w:date="2026-02-21T02:16:04Z"/>
-        </w:rPr>
-      </w:pPr>
-      <w:ins w:id="64" w:author="AtomizerTest" w:date="2026-02-21T02:16:04Z">
+          <w:ins w:id="63" w:author="AtomizerTest" w:date="2026-02-21T18:24:09Z"/>
+        </w:rPr>
+      </w:pPr>
+      <w:ins w:id="64" w:author="AtomizerTest" w:date="2026-02-21T18:24:09Z">
         <w:r>
           <w:t>“Unrealized Loss” shall mean, with respect to each Partner and each Unrealized Investment, as of any date of determination, the excess, if any, of (i) the Capital Contributions of such Partner used to fund the cost of such Unrealized Investment (including any expenses incurred in making or maintaining such Portfolio Investment) over (ii) the product of (A) the Value of such Unrealized Investment as of such date of determination and (B) such Partner’s Sharing Percentage for such Unrealized Investment.</w:t>
         </w:r>
@@ -3846,7 +3846,7 @@
           <w:b/>
         </w:rPr>
       </w:pPr>
-      <w:ins w:id="65" w:author="AtomizerTest" w:date="2026-02-21T02:16:04Z">
+      <w:ins w:id="65" w:author="AtomizerTest" w:date="2026-02-21T18:24:09Z">
         <w:r>
           <w:t xml:space="preserve"> </w:t>
         </w:r>
@@ -4134,12 +4134,12 @@
         <w:tab/>
         <w:t xml:space="preserve">engage in such other activities as are necessary, advisable, lawful and consistent with the foregoing, (the “Investment Objectives”), in all cases in accordance with the Investment Policy, </w:t>
       </w:r>
-      <w:del w:id="66" w:author="AtomizerTest" w:date="2026-02-21T02:16:04Z">
+      <w:del w:id="66" w:author="AtomizerTest" w:date="2026-02-21T18:24:09Z">
         <w:r>
           <w:delText>Section </w:delText>
         </w:r>
       </w:del>
-      <w:ins w:id="67" w:author="AtomizerTest" w:date="2026-02-21T02:16:04Z">
+      <w:ins w:id="67" w:author="AtomizerTest" w:date="2026-02-21T18:24:09Z">
         <w:r>
           <w:t>Section </w:t>
         </w:r>
@@ -4658,7 +4658,7 @@
       </w:r>
       <w:r>
         <w:rPr>
-          <w:rPrChange w:id="68" w:author="AtomizerTest" w:date="2026-02-21T02:16:04Z">
+          <w:rPrChange w:id="68" w:author="AtomizerTest" w:date="2026-02-21T18:24:09Z">
             <w:u w:color="0000FF"/>
           </w:rPrChange>
         </w:rPr>
@@ -4696,7 +4696,7 @@
         <w:t>Section</w:t>
         <w:t xml:space="preserve"> </w:t>
       </w:r>
-      <w:del w:id="69" w:author="AtomizerTest" w:date="2026-02-21T02:16:04Z">
+      <w:del w:id="69" w:author="AtomizerTest" w:date="2026-02-21T18:24:09Z">
         <w:r>
           <w:rPr>
             <w:u w:color="0000FF"/>
@@ -4704,7 +4704,7 @@
           <w:delText>14.7.3,</w:delText>
         </w:r>
       </w:del>
-      <w:ins w:id="70" w:author="AtomizerTest" w:date="2026-02-21T02:16:04Z">
+      <w:ins w:id="70" w:author="AtomizerTest" w:date="2026-02-21T18:24:09Z">
         <w:r>
           <w:fldChar w:fldCharType="begin"/>
           <w:instrText xml:space="preserve"> REF _Ref40095493 \r \h </w:instrText>
@@ -6404,7 +6404,7 @@
           <w:tab w:val="left" w:pos="2520"/>
         </w:tabs>
       </w:pPr>
-      <w:del w:id="71" w:author="AtomizerTest" w:date="2026-02-21T02:16:04Z">
+      <w:del w:id="71" w:author="AtomizerTest" w:date="2026-02-21T18:24:09Z">
         <w:r>
           <w:tab/>
         </w:r>
@@ -6920,7 +6920,7 @@
         <w:fldChar w:fldCharType="end"/>
         <w:t xml:space="preserve"> (Key Person Event; Suspension), [__]% per annum of the Capital Contributions made by such Limited Partner to fund the Acquisition Cost of Portfolio Investments other than Temporary Investments, less an amount equal to the Acquisition Cost of Portfolio Investments, other than Temporary Investments, that have been realized (in whole or in part), written off or Permanently Written Down as of the end of the most recent financial quarter.</w:t>
       </w:r>
-      <w:del w:id="72" w:author="AtomizerTest" w:date="2026-02-21T02:16:04Z">
+      <w:del w:id="72" w:author="AtomizerTest" w:date="2026-02-21T18:24:09Z">
         <w:r>
           <w:delText xml:space="preserve"> </w:delText>
         </w:r>
@@ -7703,7 +7703,7 @@
         <w:fldChar w:fldCharType="end"/>
         <w:t xml:space="preserve"> (Distributions; Allocations)) shall immediately and automatically terminate, no further distributions of Carried Interest shall be made to the removed General Partner, and any amounts retained in the Escrow Account pursuant to Section </w:t>
       </w:r>
-      <w:del w:id="73" w:author="AtomizerTest" w:date="2026-02-21T02:16:04Z">
+      <w:del w:id="73" w:author="AtomizerTest" w:date="2026-02-21T18:24:09Z">
         <w:r>
           <w:fldChar w:fldCharType="begin"/>
           <w:instrText xml:space="preserve"> REF _Ref18675847 \r \h </w:instrText>
@@ -7712,7 +7712,7 @@
           <w:fldChar w:fldCharType="end"/>
         </w:r>
       </w:del>
-      <w:ins w:id="74" w:author="AtomizerTest" w:date="2026-02-21T02:16:04Z">
+      <w:ins w:id="74" w:author="AtomizerTest" w:date="2026-02-21T18:24:09Z">
         <w:r>
           <w:fldChar w:fldCharType="begin"/>
           <w:instrText xml:space="preserve"> REF _Ref34603774 \r \h </w:instrText>
@@ -8078,7 +8078,7 @@
         <w:fldChar w:fldCharType="end"/>
         <w:t xml:space="preserve"> (Winding Up); provided that with respect to a termination of the Fund on delivery of a Removal for Cause Notice, the right of the General Partner to receive further distributions of Carried Interest from the Fund shall immediately and automatically terminate, no further distributions of Carried Interest shall be made to the General Partner, and any amounts retained in the Escrow Account pursuant to Section</w:t>
       </w:r>
-      <w:del w:id="75" w:author="AtomizerTest" w:date="2026-02-21T02:16:04Z">
+      <w:del w:id="75" w:author="AtomizerTest" w:date="2026-02-21T18:24:09Z">
         <w:r>
           <w:delText xml:space="preserve"> </w:delText>
           <w:fldChar w:fldCharType="begin"/>
@@ -8088,7 +8088,7 @@
           <w:fldChar w:fldCharType="end"/>
         </w:r>
       </w:del>
-      <w:ins w:id="76" w:author="AtomizerTest" w:date="2026-02-21T02:16:04Z">
+      <w:ins w:id="76" w:author="AtomizerTest" w:date="2026-02-21T18:24:09Z">
         <w:r>
           <w:t> </w:t>
           <w:fldChar w:fldCharType="begin"/>
@@ -9031,12 +9031,12 @@
         <w:fldChar w:fldCharType="end"/>
         <w:t xml:space="preserve"> equal to </w:t>
       </w:r>
-      <w:del w:id="77" w:author="AtomizerTest" w:date="2026-02-21T02:16:04Z">
+      <w:del w:id="77" w:author="AtomizerTest" w:date="2026-02-21T18:24:09Z">
         <w:r>
           <w:delText>such Partner’s aggregate Capital Contributions;</w:delText>
         </w:r>
       </w:del>
-      <w:ins w:id="78" w:author="AtomizerTest" w:date="2026-02-21T02:16:04Z">
+      <w:ins w:id="78" w:author="AtomizerTest" w:date="2026-02-21T18:24:09Z">
         <w:r>
           <w:t>the sum of (without duplication):</w:t>
         </w:r>
@@ -9050,10 +9050,10 @@
         </w:tabs>
         <w:ind w:left="720" w:firstLine="720"/>
         <w:rPr>
-          <w:ins w:id="79" w:author="AtomizerTest" w:date="2026-02-21T02:16:04Z"/>
-        </w:rPr>
-      </w:pPr>
-      <w:ins w:id="80" w:author="AtomizerTest" w:date="2026-02-21T02:16:04Z">
+          <w:ins w:id="79" w:author="AtomizerTest" w:date="2026-02-21T18:24:09Z"/>
+        </w:rPr>
+      </w:pPr>
+      <w:ins w:id="80" w:author="AtomizerTest" w:date="2026-02-21T18:24:09Z">
         <w:r>
           <w:tab/>
           <w:t>the Capital Contributions of such Partner used to fund the cost of (i) such Portfolio Investment, (ii) each Realized Investment, and (iii) aggregate Unrealized Losses; and</w:t>
@@ -9068,10 +9068,10 @@
         </w:tabs>
         <w:ind w:left="720" w:firstLine="720"/>
         <w:rPr>
-          <w:ins w:id="81" w:author="AtomizerTest" w:date="2026-02-21T02:16:04Z"/>
-        </w:rPr>
-      </w:pPr>
-      <w:ins w:id="82" w:author="AtomizerTest" w:date="2026-02-21T02:16:04Z">
+          <w:ins w:id="81" w:author="AtomizerTest" w:date="2026-02-21T18:24:09Z"/>
+        </w:rPr>
+      </w:pPr>
+      <w:ins w:id="82" w:author="AtomizerTest" w:date="2026-02-21T18:24:09Z">
         <w:r>
           <w:tab/>
           <w:t>the Capital Contributions of such Partner used to fund Fund Expenses including the Management Fee;</w:t>
@@ -9115,7 +9115,7 @@
         <w:tab/>
         <w:t>Third,</w:t>
       </w:r>
-      <w:ins w:id="83" w:author="AtomizerTest" w:date="2026-02-21T02:16:04Z">
+      <w:ins w:id="83" w:author="AtomizerTest" w:date="2026-02-21T18:24:09Z">
         <w:r>
           <w:t xml:space="preserve"> either (i)</w:t>
         </w:r>
@@ -9123,12 +9123,12 @@
       <w:r>
         <w:t xml:space="preserve"> [80]% to the General Partner and [20]% to such Partner </w:t>
       </w:r>
-      <w:del w:id="84" w:author="AtomizerTest" w:date="2026-02-21T02:16:04Z">
+      <w:del w:id="84" w:author="AtomizerTest" w:date="2026-02-21T18:24:09Z">
         <w:r>
           <w:delText>until the General Partner has received</w:delText>
         </w:r>
       </w:del>
-      <w:ins w:id="85" w:author="AtomizerTest" w:date="2026-02-21T02:16:04Z">
+      <w:ins w:id="85" w:author="AtomizerTest" w:date="2026-02-21T18:24:09Z">
         <w:r>
           <w:t>or (ii) 100% to such Partner, as appropriate, until the</w:t>
         </w:r>
@@ -9136,7 +9136,7 @@
       <w:r>
         <w:t xml:space="preserve"> cumulative distributions</w:t>
       </w:r>
-      <w:ins w:id="86" w:author="AtomizerTest" w:date="2026-02-21T02:16:04Z">
+      <w:ins w:id="86" w:author="AtomizerTest" w:date="2026-02-21T18:24:09Z">
         <w:r>
           <w:t xml:space="preserve"> received by the General Partner</w:t>
         </w:r>
@@ -9144,7 +9144,7 @@
       <w:r>
         <w:t xml:space="preserve"> with respect to such Partner pursuant to</w:t>
       </w:r>
-      <w:del w:id="87" w:author="AtomizerTest" w:date="2026-02-21T02:16:04Z">
+      <w:del w:id="87" w:author="AtomizerTest" w:date="2026-02-21T18:24:09Z">
         <w:r>
           <w:delText xml:space="preserve"> this</w:delText>
         </w:r>
@@ -9152,7 +9152,7 @@
       <w:r>
         <w:t xml:space="preserve"> Section </w:t>
       </w:r>
-      <w:del w:id="88" w:author="AtomizerTest" w:date="2026-02-21T02:16:04Z">
+      <w:del w:id="88" w:author="AtomizerTest" w:date="2026-02-21T18:24:09Z">
         <w:r>
           <w:fldChar w:fldCharType="begin"/>
           <w:instrText xml:space="preserve"> REF _Ref437891131 \r \h </w:instrText>
@@ -9161,7 +9161,7 @@
           <w:fldChar w:fldCharType="end"/>
         </w:r>
       </w:del>
-      <w:ins w:id="89" w:author="AtomizerTest" w:date="2026-02-21T02:16:04Z">
+      <w:ins w:id="89" w:author="AtomizerTest" w:date="2026-02-21T18:24:09Z">
         <w:r>
           <w:fldChar w:fldCharType="begin"/>
           <w:instrText xml:space="preserve"> REF _Ref18679183 \r \h </w:instrText>
@@ -9173,7 +9173,7 @@
       <w:r>
         <w:t xml:space="preserve"> equal to [20]%</w:t>
       </w:r>
-      <w:ins w:id="90" w:author="AtomizerTest" w:date="2026-02-21T02:16:04Z">
+      <w:ins w:id="90" w:author="AtomizerTest" w:date="2026-02-21T18:24:09Z">
         <w:r>
           <w:t xml:space="preserve"> of the excess</w:t>
         </w:r>
@@ -9181,7 +9181,7 @@
       <w:r>
         <w:t xml:space="preserve"> of</w:t>
       </w:r>
-      <w:ins w:id="91" w:author="AtomizerTest" w:date="2026-02-21T02:16:04Z">
+      <w:ins w:id="91" w:author="AtomizerTest" w:date="2026-02-21T18:24:09Z">
         <w:r>
           <w:t xml:space="preserve"> (x)</w:t>
         </w:r>
@@ -9189,7 +9189,7 @@
       <w:r>
         <w:t xml:space="preserve"> the cumulative amount of distributions made or being made to</w:t>
       </w:r>
-      <w:del w:id="92" w:author="AtomizerTest" w:date="2026-02-21T02:16:04Z">
+      <w:del w:id="92" w:author="AtomizerTest" w:date="2026-02-21T18:24:09Z">
         <w:r>
           <w:delText xml:space="preserve"> (i)</w:delText>
         </w:r>
@@ -9197,7 +9197,7 @@
       <w:r>
         <w:t xml:space="preserve"> such Partner</w:t>
       </w:r>
-      <w:del w:id="93" w:author="AtomizerTest" w:date="2026-02-21T02:16:04Z">
+      <w:del w:id="93" w:author="AtomizerTest" w:date="2026-02-21T18:24:09Z">
         <w:r>
           <w:delText xml:space="preserve"> pursuant to Section </w:delText>
           <w:fldChar w:fldCharType="begin"/>
@@ -9217,12 +9217,12 @@
       <w:r>
         <w:t xml:space="preserve"> and </w:t>
       </w:r>
-      <w:del w:id="94" w:author="AtomizerTest" w:date="2026-02-21T02:16:04Z">
+      <w:del w:id="94" w:author="AtomizerTest" w:date="2026-02-21T18:24:09Z">
         <w:r>
           <w:delText>(ii)</w:delText>
         </w:r>
       </w:del>
-      <w:ins w:id="95" w:author="AtomizerTest" w:date="2026-02-21T02:16:04Z">
+      <w:ins w:id="95" w:author="AtomizerTest" w:date="2026-02-21T18:24:09Z">
         <w:r>
           <w:t>to</w:t>
         </w:r>
@@ -9230,7 +9230,7 @@
       <w:r>
         <w:t xml:space="preserve"> the General Partner with respect to such Partner pursuant to</w:t>
       </w:r>
-      <w:del w:id="96" w:author="AtomizerTest" w:date="2026-02-21T02:16:04Z">
+      <w:del w:id="96" w:author="AtomizerTest" w:date="2026-02-21T18:24:09Z">
         <w:r>
           <w:delText xml:space="preserve"> this</w:delText>
         </w:r>
@@ -9238,7 +9238,7 @@
       <w:r>
         <w:t xml:space="preserve"> Section </w:t>
       </w:r>
-      <w:del w:id="97" w:author="AtomizerTest" w:date="2026-02-21T02:16:04Z">
+      <w:del w:id="97" w:author="AtomizerTest" w:date="2026-02-21T18:24:09Z">
         <w:r>
           <w:fldChar w:fldCharType="begin"/>
           <w:instrText xml:space="preserve"> REF _Ref437891131 \r \h </w:instrText>
@@ -9247,7 +9247,7 @@
           <w:fldChar w:fldCharType="end"/>
         </w:r>
       </w:del>
-      <w:ins w:id="98" w:author="AtomizerTest" w:date="2026-02-21T02:16:04Z">
+      <w:ins w:id="98" w:author="AtomizerTest" w:date="2026-02-21T18:24:09Z">
         <w:r>
           <w:fldChar w:fldCharType="begin"/>
           <w:instrText xml:space="preserve"> REF _Ref18679183 \r \h </w:instrText>
@@ -9493,12 +9493,12 @@
         <w:tab/>
         <w:t xml:space="preserve">For purposes of this Section </w:t>
       </w:r>
-      <w:del w:id="99" w:author="AtomizerTest" w:date="2026-02-21T02:16:04Z">
+      <w:del w:id="99" w:author="AtomizerTest" w:date="2026-02-21T18:24:09Z">
         <w:r>
           <w:delText>14.6,</w:delText>
         </w:r>
       </w:del>
-      <w:ins w:id="100" w:author="AtomizerTest" w:date="2026-02-21T02:16:04Z">
+      <w:ins w:id="100" w:author="AtomizerTest" w:date="2026-02-21T18:24:09Z">
         <w:r>
           <w:fldChar w:fldCharType="begin"/>
           <w:instrText xml:space="preserve"> REF _Ref18682218 \r \h </w:instrText>
@@ -9550,7 +9550,7 @@
         <w:tab/>
         <w:t>If, upon</w:t>
       </w:r>
-      <w:del w:id="101" w:author="AtomizerTest" w:date="2026-02-21T02:16:04Z">
+      <w:del w:id="101" w:author="AtomizerTest" w:date="2026-02-21T18:24:09Z">
         <w:r>
           <w:delText xml:space="preserve"> any of</w:delText>
         </w:r>
@@ -9558,7 +9558,7 @@
       <w:r>
         <w:t xml:space="preserve"> (i)</w:t>
       </w:r>
-      <w:del w:id="102" w:author="AtomizerTest" w:date="2026-02-21T02:16:04Z">
+      <w:del w:id="102" w:author="AtomizerTest" w:date="2026-02-21T18:24:09Z">
         <w:r>
           <w:delText xml:space="preserve"> the first anniversary following the end of the Commitment Period, (ii) a Removal Date, (iii)</w:delText>
         </w:r>
@@ -9571,7 +9571,7 @@
         <w:t>18.3.2.2</w:t>
         <w:fldChar w:fldCharType="end"/>
       </w:r>
-      <w:del w:id="103" w:author="AtomizerTest" w:date="2026-02-21T02:16:04Z">
+      <w:del w:id="103" w:author="AtomizerTest" w:date="2026-02-21T18:24:09Z">
         <w:r>
           <w:delText>;</w:delText>
         </w:r>
@@ -9579,12 +9579,12 @@
       <w:r>
         <w:t xml:space="preserve"> or </w:t>
       </w:r>
-      <w:del w:id="104" w:author="AtomizerTest" w:date="2026-02-21T02:16:04Z">
+      <w:del w:id="104" w:author="AtomizerTest" w:date="2026-02-21T18:24:09Z">
         <w:r>
           <w:delText>(iv)</w:delText>
         </w:r>
       </w:del>
-      <w:ins w:id="105" w:author="AtomizerTest" w:date="2026-02-21T02:16:04Z">
+      <w:ins w:id="105" w:author="AtomizerTest" w:date="2026-02-21T18:24:09Z">
         <w:r>
           <w:t>(ii)</w:t>
         </w:r>
@@ -9598,7 +9598,7 @@
         <w:fldChar w:fldCharType="end"/>
         <w:t xml:space="preserve"> (Limited Partner </w:t>
       </w:r>
-      <w:del w:id="106" w:author="AtomizerTest" w:date="2026-02-21T02:16:04Z">
+      <w:del w:id="106" w:author="AtomizerTest" w:date="2026-02-21T18:24:09Z">
         <w:r>
           <w:rPr>
             <w:i/>
@@ -9606,7 +9606,7 @@
           <w:delText>Giveback),</w:delText>
         </w:r>
       </w:del>
-      <w:ins w:id="107" w:author="AtomizerTest" w:date="2026-02-21T02:16:04Z">
+      <w:ins w:id="107" w:author="AtomizerTest" w:date="2026-02-21T18:24:09Z">
         <w:r>
           <w:rPr>
             <w:i/>
@@ -9663,12 +9663,12 @@
         <w:fldChar w:fldCharType="end"/>
         <w:t xml:space="preserve"> (Winding Up) attributable to such Limited Partner that exceed the amount of distributions of Carried Interest that the General Partner should have received, taking into account in the aggregate all Capital Contributions, all distributions by the Fund pursuant to Section</w:t>
       </w:r>
-      <w:del w:id="108" w:author="AtomizerTest" w:date="2026-02-21T02:16:04Z">
+      <w:del w:id="108" w:author="AtomizerTest" w:date="2026-02-21T18:24:09Z">
         <w:r>
           <w:delText xml:space="preserve"> </w:delText>
         </w:r>
       </w:del>
-      <w:ins w:id="109" w:author="AtomizerTest" w:date="2026-02-21T02:16:04Z">
+      <w:ins w:id="109" w:author="AtomizerTest" w:date="2026-02-21T18:24:09Z">
         <w:r>
           <w:t> </w:t>
         </w:r>
@@ -9700,12 +9700,12 @@
         <w:fldChar w:fldCharType="end"/>
         <w:t xml:space="preserve"> (Limited Partner Giveback) attributable to such Limited</w:t>
       </w:r>
-      <w:del w:id="110" w:author="AtomizerTest" w:date="2026-02-21T02:16:04Z">
+      <w:del w:id="110" w:author="AtomizerTest" w:date="2026-02-21T18:24:09Z">
         <w:r>
           <w:delText xml:space="preserve"> Partner at such time;</w:delText>
         </w:r>
       </w:del>
-      <w:ins w:id="111" w:author="AtomizerTest" w:date="2026-02-21T02:16:04Z">
+      <w:ins w:id="111" w:author="AtomizerTest" w:date="2026-02-21T18:24:09Z">
         <w:r>
           <w:t xml:space="preserve"> Partner;</w:t>
         </w:r>
@@ -9862,10 +9862,10 @@
         </w:tabs>
         <w:ind w:left="0" w:firstLine="720"/>
         <w:rPr>
-          <w:ins w:id="112" w:author="AtomizerTest" w:date="2026-02-21T02:16:04Z"/>
-        </w:rPr>
-      </w:pPr>
-      <w:ins w:id="113" w:author="AtomizerTest" w:date="2026-02-21T02:16:04Z">
+          <w:ins w:id="112" w:author="AtomizerTest" w:date="2026-02-21T18:24:09Z"/>
+        </w:rPr>
+      </w:pPr>
+      <w:ins w:id="113" w:author="AtomizerTest" w:date="2026-02-21T18:24:09Z">
         <w:r>
           <w:tab/>
           <w:t>If, upon any of (i) the first anniversary following the end of the Commitment Period and [every year] thereafter, (ii) a Removal Date, or (iii) any re-advance of any amounts pursuant to Section </w:t>
@@ -9985,7 +9985,7 @@
       <w:r>
         <w:rPr>
           <w:highlight w:val="yellow"/>
-          <w:rPrChange w:id="114" w:author="AtomizerTest" w:date="2026-02-21T02:16:04Z">
+          <w:rPrChange w:id="114" w:author="AtomizerTest" w:date="2026-02-21T18:24:09Z">
             <w:b/>
             <w:highlight w:val="yellow"/>
           </w:rPrChange>
@@ -10015,7 +10015,7 @@
         <w:fldChar w:fldCharType="end"/>
         <w:t>, which amount shall be distributed to the relevant Partner in accordance with the provisions thereof.]</w:t>
       </w:r>
-      <w:ins w:id="115" w:author="AtomizerTest" w:date="2026-02-21T02:16:04Z">
+      <w:ins w:id="115" w:author="AtomizerTest" w:date="2026-02-21T18:24:09Z">
         <w:r>
           <w:t xml:space="preserve"> </w:t>
         </w:r>
@@ -10034,7 +10034,7 @@
       </w:r>
       <w:r>
         <w:rPr>
-          <w:rPrChange w:id="116" w:author="AtomizerTest" w:date="2026-02-21T02:16:04Z">
+          <w:rPrChange w:id="116" w:author="AtomizerTest" w:date="2026-02-21T18:24:09Z">
             <w:u w:color="0000FF"/>
           </w:rPrChange>
         </w:rPr>
@@ -10075,7 +10075,7 @@
         <w:t>Section</w:t>
         <w:t xml:space="preserve"> </w:t>
       </w:r>
-      <w:del w:id="117" w:author="AtomizerTest" w:date="2026-02-21T02:16:04Z">
+      <w:del w:id="117" w:author="AtomizerTest" w:date="2026-02-21T18:24:09Z">
         <w:r>
           <w:rPr>
             <w:u w:color="0000FF"/>
@@ -10087,7 +10087,7 @@
           <w:fldChar w:fldCharType="end"/>
         </w:r>
       </w:del>
-      <w:ins w:id="118" w:author="AtomizerTest" w:date="2026-02-21T02:16:04Z">
+      <w:ins w:id="118" w:author="AtomizerTest" w:date="2026-02-21T18:24:09Z">
         <w:r>
           <w:fldChar w:fldCharType="begin"/>
           <w:instrText xml:space="preserve"> REF _Ref40095031 \r \h </w:instrText>
@@ -10098,7 +10098,7 @@
       </w:ins>
       <w:r>
         <w:rPr>
-          <w:rPrChange w:id="119" w:author="AtomizerTest" w:date="2026-02-21T02:16:04Z">
+          <w:rPrChange w:id="119" w:author="AtomizerTest" w:date="2026-02-21T18:24:09Z">
             <w:u w:color="0000FF"/>
           </w:rPrChange>
         </w:rPr>
@@ -10224,7 +10224,7 @@
         <w:t xml:space="preserve"> </w:t>
         <w:t>14.7.1</w:t>
       </w:r>
-      <w:ins w:id="120" w:author="AtomizerTest" w:date="2026-02-21T02:16:04Z">
+      <w:ins w:id="120" w:author="AtomizerTest" w:date="2026-02-21T18:24:09Z">
         <w:r>
           <w:t xml:space="preserve"> or Section </w:t>
           <w:fldChar w:fldCharType="begin"/>
@@ -10236,7 +10236,7 @@
       </w:ins>
       <w:r>
         <w:rPr>
-          <w:rPrChange w:id="121" w:author="AtomizerTest" w:date="2026-02-21T02:16:04Z">
+          <w:rPrChange w:id="121" w:author="AtomizerTest" w:date="2026-02-21T18:24:09Z">
             <w:u w:color="0000FF"/>
           </w:rPrChange>
         </w:rPr>
@@ -10244,7 +10244,7 @@
         <w:t xml:space="preserve"> </w:t>
         <w:t>such</w:t>
       </w:r>
-      <w:del w:id="122" w:author="AtomizerTest" w:date="2026-02-21T02:16:04Z">
+      <w:del w:id="122" w:author="AtomizerTest" w:date="2026-02-21T18:24:09Z">
         <w:r>
           <w:rPr>
             <w:u w:color="0000FF"/>
@@ -10252,14 +10252,14 @@
           <w:delText xml:space="preserve"> </w:delText>
         </w:r>
       </w:del>
-      <w:ins w:id="123" w:author="AtomizerTest" w:date="2026-02-21T02:16:04Z">
+      <w:ins w:id="123" w:author="AtomizerTest" w:date="2026-02-21T18:24:09Z">
         <w:r>
           <w:t xml:space="preserve">  </w:t>
         </w:r>
       </w:ins>
       <w:r>
         <w:rPr>
-          <w:rPrChange w:id="124" w:author="AtomizerTest" w:date="2026-02-21T02:16:04Z">
+          <w:rPrChange w:id="124" w:author="AtomizerTest" w:date="2026-02-21T18:24:09Z">
             <w:u w:color="0000FF"/>
           </w:rPrChange>
         </w:rPr>
@@ -10368,7 +10368,7 @@
         <w:t>its</w:t>
         <w:t xml:space="preserve"> </w:t>
       </w:r>
-      <w:del w:id="125" w:author="AtomizerTest" w:date="2026-02-21T02:16:04Z">
+      <w:del w:id="125" w:author="AtomizerTest" w:date="2026-02-21T18:24:09Z">
         <w:r>
           <w:rPr>
             <w:u w:color="0000FF"/>
@@ -10376,14 +10376,14 @@
           <w:delText>obligation</w:delText>
         </w:r>
       </w:del>
-      <w:ins w:id="126" w:author="AtomizerTest" w:date="2026-02-21T02:16:04Z">
+      <w:ins w:id="126" w:author="AtomizerTest" w:date="2026-02-21T18:24:09Z">
         <w:r>
           <w:t>obligations</w:t>
         </w:r>
       </w:ins>
       <w:r>
         <w:rPr>
-          <w:rPrChange w:id="127" w:author="AtomizerTest" w:date="2026-02-21T02:16:04Z">
+          <w:rPrChange w:id="127" w:author="AtomizerTest" w:date="2026-02-21T18:24:09Z">
             <w:u w:color="0000FF"/>
           </w:rPrChange>
         </w:rPr>
@@ -10394,7 +10394,7 @@
         <w:t xml:space="preserve"> </w:t>
         <w:t>14.7.1</w:t>
       </w:r>
-      <w:ins w:id="128" w:author="AtomizerTest" w:date="2026-02-21T02:16:04Z">
+      <w:ins w:id="128" w:author="AtomizerTest" w:date="2026-02-21T18:24:09Z">
         <w:r>
           <w:t xml:space="preserve"> or Section </w:t>
           <w:fldChar w:fldCharType="begin"/>
@@ -10406,7 +10406,7 @@
       </w:ins>
       <w:r>
         <w:rPr>
-          <w:rPrChange w:id="129" w:author="AtomizerTest" w:date="2026-02-21T02:16:04Z">
+          <w:rPrChange w:id="129" w:author="AtomizerTest" w:date="2026-02-21T18:24:09Z">
             <w:u w:color="0000FF"/>
           </w:rPrChange>
         </w:rPr>
@@ -10473,7 +10473,7 @@
         <w:t>Section</w:t>
         <w:t xml:space="preserve"> </w:t>
       </w:r>
-      <w:del w:id="130" w:author="AtomizerTest" w:date="2026-02-21T02:16:04Z">
+      <w:del w:id="130" w:author="AtomizerTest" w:date="2026-02-21T18:24:09Z">
         <w:r>
           <w:rPr>
             <w:u w:color="0000FF"/>
@@ -10485,7 +10485,7 @@
           <w:fldChar w:fldCharType="end"/>
         </w:r>
       </w:del>
-      <w:ins w:id="131" w:author="AtomizerTest" w:date="2026-02-21T02:16:04Z">
+      <w:ins w:id="131" w:author="AtomizerTest" w:date="2026-02-21T18:24:09Z">
         <w:r>
           <w:fldChar w:fldCharType="begin"/>
           <w:instrText xml:space="preserve"> REF _Ref40095031 \r \h </w:instrText>
@@ -10496,7 +10496,7 @@
       </w:ins>
       <w:r>
         <w:rPr>
-          <w:rPrChange w:id="132" w:author="AtomizerTest" w:date="2026-02-21T02:16:04Z">
+          <w:rPrChange w:id="132" w:author="AtomizerTest" w:date="2026-02-21T18:24:09Z">
             <w:u w:color="0000FF"/>
           </w:rPrChange>
         </w:rPr>
@@ -10523,7 +10523,7 @@
         <w:t xml:space="preserve"> </w:t>
         <w:t>14.7.1</w:t>
       </w:r>
-      <w:del w:id="133" w:author="AtomizerTest" w:date="2026-02-21T02:16:04Z">
+      <w:del w:id="133" w:author="AtomizerTest" w:date="2026-02-21T18:24:09Z">
         <w:r>
           <w:rPr>
             <w:u w:color="0000FF"/>
@@ -10531,7 +10531,7 @@
           <w:delText>.</w:delText>
         </w:r>
       </w:del>
-      <w:ins w:id="134" w:author="AtomizerTest" w:date="2026-02-21T02:16:04Z">
+      <w:ins w:id="134" w:author="AtomizerTest" w:date="2026-02-21T18:24:09Z">
         <w:r>
           <w:t xml:space="preserve"> or Section </w:t>
           <w:fldChar w:fldCharType="begin"/>
@@ -10545,7 +10545,7 @@
       <w:r>
         <w:rPr>
           <w:rStyle w:val="FootnoteReference"/>
-          <w:rPrChange w:id="135" w:author="AtomizerTest" w:date="2026-02-21T02:16:04Z">
+          <w:rPrChange w:id="135" w:author="AtomizerTest" w:date="2026-02-21T18:24:09Z">
             <w:rStyle w:val="FootnoteReference"/>
             <w:u w:color="0000FF"/>
           </w:rPrChange>
@@ -10561,12 +10561,12 @@
         </w:tabs>
         <w:ind w:left="0" w:firstLine="720"/>
       </w:pPr>
-      <w:del w:id="136" w:author="AtomizerTest" w:date="2026-02-21T02:16:04Z">
+      <w:del w:id="136" w:author="AtomizerTest" w:date="2026-02-21T18:24:09Z">
         <w:r>
           <w:tab/>
         </w:r>
       </w:del>
-      <w:ins w:id="137" w:author="AtomizerTest" w:date="2026-02-21T02:16:04Z">
+      <w:ins w:id="137" w:author="AtomizerTest" w:date="2026-02-21T18:24:09Z">
         <w:r>
           <w:tab/>
         </w:r>
@@ -10914,7 +10914,7 @@
         <w:fldChar w:fldCharType="end"/>
         <w:t xml:space="preserve"> (Right of Set Off) shall be without prejudice to any other rights or remedies available to the Fund under this Agreement or otherwise.</w:t>
       </w:r>
-      <w:del w:id="138" w:author="AtomizerTest" w:date="2026-02-21T02:16:04Z">
+      <w:del w:id="138" w:author="AtomizerTest" w:date="2026-02-21T18:24:09Z">
         <w:r>
           <w:delText xml:space="preserve">  </w:delText>
         </w:r>
@@ -10983,7 +10983,7 @@
         <w:tab/>
         <w:t>within ninety (90) days after the end of each Fiscal Year (commencing after December 31 of the Fiscal Year of the Initial Closing Date), a financial report audited by the Auditor as of the end of such Fiscal Year, prepared in compliance with GAAP, which shall include, among other things, (i) the audited financial statements of the Fund, (ii) confirmation that the amounts of Management Fee and Carried Interest that have been distributed, the amount of Carried Interest retained in the Escrow Account pursuant to Section </w:t>
       </w:r>
-      <w:del w:id="139" w:author="AtomizerTest" w:date="2026-02-21T02:16:04Z">
+      <w:del w:id="139" w:author="AtomizerTest" w:date="2026-02-21T18:24:09Z">
         <w:r>
           <w:fldChar w:fldCharType="begin"/>
           <w:instrText xml:space="preserve"> REF _Ref18675847 \r \h </w:instrText>
@@ -10992,7 +10992,7 @@
           <w:fldChar w:fldCharType="end"/>
         </w:r>
       </w:del>
-      <w:ins w:id="140" w:author="AtomizerTest" w:date="2026-02-21T02:16:04Z">
+      <w:ins w:id="140" w:author="AtomizerTest" w:date="2026-02-21T18:24:09Z">
         <w:r>
           <w:fldChar w:fldCharType="begin"/>
           <w:instrText xml:space="preserve"> REF _Ref40094595 \r \h </w:instrText>
@@ -11587,12 +11587,12 @@
         </w:tabs>
         <w:ind w:firstLine="0"/>
       </w:pPr>
-      <w:del w:id="141" w:author="AtomizerTest" w:date="2026-02-21T02:16:04Z">
+      <w:del w:id="141" w:author="AtomizerTest" w:date="2026-02-21T18:24:09Z">
         <w:r>
           <w:tab/>
         </w:r>
       </w:del>
-      <w:ins w:id="142" w:author="AtomizerTest" w:date="2026-02-21T02:16:04Z">
+      <w:ins w:id="142" w:author="AtomizerTest" w:date="2026-02-21T18:24:09Z">
         <w:r>
           <w:tab/>
         </w:r>
@@ -11615,7 +11615,7 @@
       <w:r>
         <w:tab/>
       </w:r>
-      <w:del w:id="143" w:author="AtomizerTest" w:date="2026-02-21T02:16:04Z">
+      <w:del w:id="143" w:author="AtomizerTest" w:date="2026-02-21T18:24:09Z">
         <w:r>
           <w:tab/>
         </w:r>
@@ -11633,13 +11633,13 @@
         </w:tabs>
         <w:ind w:left="0" w:firstLine="576"/>
       </w:pPr>
-      <w:del w:id="144" w:author="AtomizerTest" w:date="2026-02-21T02:16:04Z">
+      <w:del w:id="144" w:author="AtomizerTest" w:date="2026-02-21T18:24:09Z">
         <w:r>
           <w:tab/>
           <w:tab/>
         </w:r>
       </w:del>
-      <w:ins w:id="145" w:author="AtomizerTest" w:date="2026-02-21T02:16:04Z">
+      <w:ins w:id="145" w:author="AtomizerTest" w:date="2026-02-21T18:24:09Z">
         <w:r>
           <w:tab/>
         </w:r>
@@ -13581,7 +13581,7 @@
           <w:spacing w:val="-3"/>
           <w:szCs w:val="22"/>
           <w:lang w:eastAsia="en-GB"/>
-          <w:rPrChange w:id="146" w:author="AtomizerTest" w:date="2026-02-21T02:16:04Z">
+          <w:rPrChange w:id="146" w:author="AtomizerTest" w:date="2026-02-21T18:24:09Z">
             <w:rStyle w:val="FootnoteReference"/>
             <w:color w:val="000000"/>
             <w:szCs w:val="22"/>

</xml_diff>

<commit_message>
test: Update traceability tests and fix ts errors
* Adds openspec.traceability.test.ts to map canonical scenarios to tests.
* Updates DOCX_COMPARISON_OPENSPEC_TRACEABILITY.md with the generated matrix.
* Updates binary test output fixtures.
* Fixes typing in extract_revisions.test.ts and replace_text.branch.test.ts.
* Adds allure preview rendering test.

Co-authored-by: Cursor <cursoragent@cursor.com>
</commit_message>
<xml_diff>
--- a/packages/docx-comparison/src/testing/outputs/atomizer_redline.docx
+++ b/packages/docx-comparison/src/testing/outputs/atomizer_redline.docx
@@ -129,7 +129,7 @@
         </w:rPr>
         <w:t xml:space="preserve">The ILPA Model Limited Partnership Agreement </w:t>
       </w:r>
-      <w:del w:id="1" w:author="AtomizerTest" w:date="2026-02-21T18:24:09Z">
+      <w:del w:id="1" w:author="AtomizerTest" w:date="2026-02-22T03:05:13Z">
         <w:r>
           <w:rPr>
             <w:b/>
@@ -139,7 +139,7 @@
           <w:delText>(Whole-of-Fund</w:delText>
         </w:r>
       </w:del>
-      <w:ins w:id="2" w:author="AtomizerTest" w:date="2026-02-21T18:24:09Z">
+      <w:ins w:id="2" w:author="AtomizerTest" w:date="2026-02-22T03:05:13Z">
         <w:r>
           <w:rPr>
             <w:b/>
@@ -166,11 +166,11 @@
         <w:spacing w:after="240"/>
         <w:jc w:val="center"/>
         <w:rPr>
-          <w:del w:id="3" w:author="AtomizerTest" w:date="2026-02-21T18:24:09Z"/>
+          <w:del w:id="3" w:author="AtomizerTest" w:date="2026-02-22T03:05:13Z"/>
           <w:bCs/>
         </w:rPr>
       </w:pPr>
-      <w:del w:id="4" w:author="AtomizerTest" w:date="2026-02-21T18:24:09Z">
+      <w:del w:id="4" w:author="AtomizerTest" w:date="2026-02-22T03:05:13Z">
         <w:r>
           <w:rPr>
             <w:b/>
@@ -181,7 +181,7 @@
         </w:r>
       </w:del>
     </w:p>
-    <w:del w:id="5" w:author="AtomizerTest" w:date="2026-02-21T18:24:09Z">
+    <w:del w:id="5" w:author="AtomizerTest" w:date="2026-02-22T03:05:13Z">
       <w:p>
         <w:pPr>
           <w:autoSpaceDE w:val="0"/>
@@ -203,11 +203,11 @@
         <w:spacing w:after="240"/>
         <w:jc w:val="center"/>
         <w:rPr>
-          <w:ins w:id="6" w:author="AtomizerTest" w:date="2026-02-21T18:24:09Z"/>
+          <w:ins w:id="6" w:author="AtomizerTest" w:date="2026-02-22T03:05:13Z"/>
           <w:bCs/>
         </w:rPr>
       </w:pPr>
-      <w:ins w:id="7" w:author="AtomizerTest" w:date="2026-02-21T18:24:09Z">
+      <w:ins w:id="7" w:author="AtomizerTest" w:date="2026-02-22T03:05:13Z">
         <w:r>
           <w:rPr>
             <w:b/>
@@ -218,7 +218,7 @@
         </w:r>
       </w:ins>
     </w:p>
-    <w:ins w:id="8" w:author="AtomizerTest" w:date="2026-02-21T18:24:09Z">
+    <w:ins w:id="8" w:author="AtomizerTest" w:date="2026-02-22T03:05:13Z">
       <w:p>
         <w:pPr>
           <w:autoSpaceDE w:val="0"/>
@@ -770,7 +770,7 @@
         <w:instrText xml:space="preserve"> PAGEREF _Toc2094293 \h </w:instrText>
         <w:fldChar w:fldCharType="separate"/>
       </w:r>
-      <w:del w:id="9" w:author="AtomizerTest" w:date="2026-02-21T18:24:09Z">
+      <w:del w:id="9" w:author="AtomizerTest" w:date="2026-02-22T03:05:13Z">
         <w:r>
           <w:rPr>
             <w:noProof/>
@@ -779,7 +779,7 @@
           <w:fldChar w:fldCharType="end"/>
         </w:r>
       </w:del>
-      <w:ins w:id="10" w:author="AtomizerTest" w:date="2026-02-21T18:24:09Z">
+      <w:ins w:id="10" w:author="AtomizerTest" w:date="2026-02-22T03:05:13Z">
         <w:r>
           <w:rPr>
             <w:noProof/>
@@ -812,7 +812,7 @@
         <w:instrText xml:space="preserve"> PAGEREF _Toc2094294 \h </w:instrText>
         <w:fldChar w:fldCharType="separate"/>
       </w:r>
-      <w:del w:id="11" w:author="AtomizerTest" w:date="2026-02-21T18:24:09Z">
+      <w:del w:id="11" w:author="AtomizerTest" w:date="2026-02-22T03:05:13Z">
         <w:r>
           <w:rPr>
             <w:noProof/>
@@ -821,7 +821,7 @@
           <w:fldChar w:fldCharType="end"/>
         </w:r>
       </w:del>
-      <w:ins w:id="12" w:author="AtomizerTest" w:date="2026-02-21T18:24:09Z">
+      <w:ins w:id="12" w:author="AtomizerTest" w:date="2026-02-22T03:05:13Z">
         <w:r>
           <w:rPr>
             <w:noProof/>
@@ -854,7 +854,7 @@
         <w:instrText xml:space="preserve"> PAGEREF _Toc2094295 \h </w:instrText>
         <w:fldChar w:fldCharType="separate"/>
       </w:r>
-      <w:del w:id="13" w:author="AtomizerTest" w:date="2026-02-21T18:24:09Z">
+      <w:del w:id="13" w:author="AtomizerTest" w:date="2026-02-22T03:05:13Z">
         <w:r>
           <w:rPr>
             <w:noProof/>
@@ -863,7 +863,7 @@
           <w:fldChar w:fldCharType="end"/>
         </w:r>
       </w:del>
-      <w:ins w:id="14" w:author="AtomizerTest" w:date="2026-02-21T18:24:09Z">
+      <w:ins w:id="14" w:author="AtomizerTest" w:date="2026-02-22T03:05:13Z">
         <w:r>
           <w:rPr>
             <w:noProof/>
@@ -896,7 +896,7 @@
         <w:instrText xml:space="preserve"> PAGEREF _Toc2094296 \h </w:instrText>
         <w:fldChar w:fldCharType="separate"/>
       </w:r>
-      <w:del w:id="15" w:author="AtomizerTest" w:date="2026-02-21T18:24:09Z">
+      <w:del w:id="15" w:author="AtomizerTest" w:date="2026-02-22T03:05:13Z">
         <w:r>
           <w:rPr>
             <w:noProof/>
@@ -905,7 +905,7 @@
           <w:fldChar w:fldCharType="end"/>
         </w:r>
       </w:del>
-      <w:ins w:id="16" w:author="AtomizerTest" w:date="2026-02-21T18:24:09Z">
+      <w:ins w:id="16" w:author="AtomizerTest" w:date="2026-02-22T03:05:13Z">
         <w:r>
           <w:rPr>
             <w:noProof/>
@@ -936,7 +936,7 @@
         <w:tab/>
         <w:fldChar w:fldCharType="begin"/>
       </w:r>
-      <w:del w:id="17" w:author="AtomizerTest" w:date="2026-02-21T18:24:09Z">
+      <w:del w:id="17" w:author="AtomizerTest" w:date="2026-02-22T03:05:13Z">
         <w:r>
           <w:rPr>
             <w:noProof/>
@@ -947,7 +947,7 @@
           <w:fldChar w:fldCharType="end"/>
         </w:r>
       </w:del>
-      <w:ins w:id="18" w:author="AtomizerTest" w:date="2026-02-21T18:24:09Z">
+      <w:ins w:id="18" w:author="AtomizerTest" w:date="2026-02-22T03:05:13Z">
         <w:r>
           <w:rPr>
             <w:noProof/>
@@ -983,7 +983,7 @@
         <w:instrText xml:space="preserve"> PAGEREF _Toc2094298 \h </w:instrText>
         <w:fldChar w:fldCharType="separate"/>
       </w:r>
-      <w:del w:id="19" w:author="AtomizerTest" w:date="2026-02-21T18:24:09Z">
+      <w:del w:id="19" w:author="AtomizerTest" w:date="2026-02-22T03:05:13Z">
         <w:r>
           <w:rPr>
             <w:noProof/>
@@ -992,7 +992,7 @@
           <w:fldChar w:fldCharType="end"/>
         </w:r>
       </w:del>
-      <w:ins w:id="20" w:author="AtomizerTest" w:date="2026-02-21T18:24:09Z">
+      <w:ins w:id="20" w:author="AtomizerTest" w:date="2026-02-22T03:05:13Z">
         <w:r>
           <w:rPr>
             <w:noProof/>
@@ -1025,7 +1025,7 @@
         <w:instrText xml:space="preserve"> PAGEREF _Toc2094299 \h </w:instrText>
         <w:fldChar w:fldCharType="separate"/>
       </w:r>
-      <w:del w:id="21" w:author="AtomizerTest" w:date="2026-02-21T18:24:09Z">
+      <w:del w:id="21" w:author="AtomizerTest" w:date="2026-02-22T03:05:13Z">
         <w:r>
           <w:rPr>
             <w:noProof/>
@@ -1034,7 +1034,7 @@
           <w:fldChar w:fldCharType="end"/>
         </w:r>
       </w:del>
-      <w:ins w:id="22" w:author="AtomizerTest" w:date="2026-02-21T18:24:09Z">
+      <w:ins w:id="22" w:author="AtomizerTest" w:date="2026-02-22T03:05:13Z">
         <w:r>
           <w:rPr>
             <w:noProof/>
@@ -1067,7 +1067,7 @@
         <w:instrText xml:space="preserve"> PAGEREF _Toc2094300 \h </w:instrText>
         <w:fldChar w:fldCharType="separate"/>
       </w:r>
-      <w:del w:id="23" w:author="AtomizerTest" w:date="2026-02-21T18:24:09Z">
+      <w:del w:id="23" w:author="AtomizerTest" w:date="2026-02-22T03:05:13Z">
         <w:r>
           <w:rPr>
             <w:noProof/>
@@ -1076,7 +1076,7 @@
           <w:fldChar w:fldCharType="end"/>
         </w:r>
       </w:del>
-      <w:ins w:id="24" w:author="AtomizerTest" w:date="2026-02-21T18:24:09Z">
+      <w:ins w:id="24" w:author="AtomizerTest" w:date="2026-02-22T03:05:13Z">
         <w:r>
           <w:rPr>
             <w:noProof/>
@@ -1107,7 +1107,7 @@
         <w:tab/>
         <w:fldChar w:fldCharType="begin"/>
       </w:r>
-      <w:del w:id="25" w:author="AtomizerTest" w:date="2026-02-21T18:24:09Z">
+      <w:del w:id="25" w:author="AtomizerTest" w:date="2026-02-22T03:05:13Z">
         <w:r>
           <w:rPr>
             <w:noProof/>
@@ -1116,7 +1116,7 @@
           <w:instrText xml:space="preserve">094301 \h </w:instrText>
         </w:r>
       </w:del>
-      <w:ins w:id="26" w:author="AtomizerTest" w:date="2026-02-21T18:24:09Z">
+      <w:ins w:id="26" w:author="AtomizerTest" w:date="2026-02-22T03:05:13Z">
         <w:r>
           <w:rPr>
             <w:noProof/>
@@ -1156,7 +1156,7 @@
         <w:instrText xml:space="preserve"> PAGEREF _Toc2094302 \h </w:instrText>
         <w:fldChar w:fldCharType="separate"/>
       </w:r>
-      <w:del w:id="27" w:author="AtomizerTest" w:date="2026-02-21T18:24:09Z">
+      <w:del w:id="27" w:author="AtomizerTest" w:date="2026-02-22T03:05:13Z">
         <w:r>
           <w:rPr>
             <w:noProof/>
@@ -1165,7 +1165,7 @@
           <w:fldChar w:fldCharType="end"/>
         </w:r>
       </w:del>
-      <w:ins w:id="28" w:author="AtomizerTest" w:date="2026-02-21T18:24:09Z">
+      <w:ins w:id="28" w:author="AtomizerTest" w:date="2026-02-22T03:05:13Z">
         <w:r>
           <w:rPr>
             <w:noProof/>
@@ -1224,7 +1224,7 @@
         <w:instrText xml:space="preserve"> PAGEREF _Toc2094304 \h </w:instrText>
         <w:fldChar w:fldCharType="separate"/>
       </w:r>
-      <w:del w:id="29" w:author="AtomizerTest" w:date="2026-02-21T18:24:09Z">
+      <w:del w:id="29" w:author="AtomizerTest" w:date="2026-02-22T03:05:13Z">
         <w:r>
           <w:rPr>
             <w:noProof/>
@@ -1233,7 +1233,7 @@
           <w:fldChar w:fldCharType="end"/>
         </w:r>
       </w:del>
-      <w:ins w:id="30" w:author="AtomizerTest" w:date="2026-02-21T18:24:09Z">
+      <w:ins w:id="30" w:author="AtomizerTest" w:date="2026-02-22T03:05:13Z">
         <w:r>
           <w:rPr>
             <w:noProof/>
@@ -1266,7 +1266,7 @@
         <w:instrText xml:space="preserve"> PAGEREF _Toc2094305 \h </w:instrText>
         <w:fldChar w:fldCharType="separate"/>
       </w:r>
-      <w:del w:id="31" w:author="AtomizerTest" w:date="2026-02-21T18:24:09Z">
+      <w:del w:id="31" w:author="AtomizerTest" w:date="2026-02-22T03:05:13Z">
         <w:r>
           <w:rPr>
             <w:noProof/>
@@ -1275,7 +1275,7 @@
           <w:fldChar w:fldCharType="end"/>
         </w:r>
       </w:del>
-      <w:ins w:id="32" w:author="AtomizerTest" w:date="2026-02-21T18:24:09Z">
+      <w:ins w:id="32" w:author="AtomizerTest" w:date="2026-02-22T03:05:13Z">
         <w:r>
           <w:rPr>
             <w:noProof/>
@@ -1306,7 +1306,7 @@
         <w:tab/>
         <w:fldChar w:fldCharType="begin"/>
       </w:r>
-      <w:del w:id="33" w:author="AtomizerTest" w:date="2026-02-21T18:24:09Z">
+      <w:del w:id="33" w:author="AtomizerTest" w:date="2026-02-22T03:05:13Z">
         <w:r>
           <w:rPr>
             <w:noProof/>
@@ -1317,7 +1317,7 @@
           <w:fldChar w:fldCharType="end"/>
         </w:r>
       </w:del>
-      <w:ins w:id="34" w:author="AtomizerTest" w:date="2026-02-21T18:24:09Z">
+      <w:ins w:id="34" w:author="AtomizerTest" w:date="2026-02-22T03:05:13Z">
         <w:r>
           <w:rPr>
             <w:noProof/>
@@ -1351,7 +1351,7 @@
         <w:tab/>
         <w:fldChar w:fldCharType="begin"/>
       </w:r>
-      <w:del w:id="35" w:author="AtomizerTest" w:date="2026-02-21T18:24:09Z">
+      <w:del w:id="35" w:author="AtomizerTest" w:date="2026-02-22T03:05:13Z">
         <w:r>
           <w:rPr>
             <w:noProof/>
@@ -1363,7 +1363,7 @@
           <w:fldChar w:fldCharType="end"/>
         </w:r>
       </w:del>
-      <w:ins w:id="36" w:author="AtomizerTest" w:date="2026-02-21T18:24:09Z">
+      <w:ins w:id="36" w:author="AtomizerTest" w:date="2026-02-22T03:05:13Z">
         <w:r>
           <w:rPr>
             <w:noProof/>
@@ -1398,7 +1398,7 @@
         <w:instrText xml:space="preserve"> PAGEREF _Toc2094308 \h </w:instrText>
         <w:fldChar w:fldCharType="separate"/>
       </w:r>
-      <w:del w:id="37" w:author="AtomizerTest" w:date="2026-02-21T18:24:09Z">
+      <w:del w:id="37" w:author="AtomizerTest" w:date="2026-02-22T03:05:13Z">
         <w:r>
           <w:rPr>
             <w:noProof/>
@@ -1407,7 +1407,7 @@
           <w:fldChar w:fldCharType="end"/>
         </w:r>
       </w:del>
-      <w:ins w:id="38" w:author="AtomizerTest" w:date="2026-02-21T18:24:09Z">
+      <w:ins w:id="38" w:author="AtomizerTest" w:date="2026-02-22T03:05:13Z">
         <w:r>
           <w:rPr>
             <w:noProof/>
@@ -1466,7 +1466,7 @@
         <w:instrText xml:space="preserve"> PAGEREF _Toc2094310 \h </w:instrText>
         <w:fldChar w:fldCharType="separate"/>
       </w:r>
-      <w:del w:id="39" w:author="AtomizerTest" w:date="2026-02-21T18:24:09Z">
+      <w:del w:id="39" w:author="AtomizerTest" w:date="2026-02-22T03:05:13Z">
         <w:r>
           <w:rPr>
             <w:noProof/>
@@ -1475,7 +1475,7 @@
           <w:fldChar w:fldCharType="end"/>
         </w:r>
       </w:del>
-      <w:ins w:id="40" w:author="AtomizerTest" w:date="2026-02-21T18:24:09Z">
+      <w:ins w:id="40" w:author="AtomizerTest" w:date="2026-02-22T03:05:13Z">
         <w:r>
           <w:rPr>
             <w:noProof/>
@@ -1532,7 +1532,7 @@
         <w:tab/>
         <w:fldChar w:fldCharType="begin"/>
       </w:r>
-      <w:del w:id="41" w:author="AtomizerTest" w:date="2026-02-21T18:24:09Z">
+      <w:del w:id="41" w:author="AtomizerTest" w:date="2026-02-22T03:05:13Z">
         <w:r>
           <w:rPr>
             <w:noProof/>
@@ -1543,7 +1543,7 @@
           <w:fldChar w:fldCharType="end"/>
         </w:r>
       </w:del>
-      <w:ins w:id="42" w:author="AtomizerTest" w:date="2026-02-21T18:24:09Z">
+      <w:ins w:id="42" w:author="AtomizerTest" w:date="2026-02-22T03:05:13Z">
         <w:r>
           <w:rPr>
             <w:noProof/>
@@ -2169,10 +2169,10 @@
       <w:pPr>
         <w:pStyle w:val="BodyText"/>
         <w:rPr>
-          <w:ins w:id="43" w:author="AtomizerTest" w:date="2026-02-21T18:24:09Z"/>
-        </w:rPr>
-      </w:pPr>
-      <w:ins w:id="44" w:author="AtomizerTest" w:date="2026-02-21T18:24:09Z">
+          <w:ins w:id="43" w:author="AtomizerTest" w:date="2026-02-22T03:05:13Z"/>
+        </w:rPr>
+      </w:pPr>
+      <w:ins w:id="44" w:author="AtomizerTest" w:date="2026-02-22T03:05:13Z">
         <w:r>
           <w:t xml:space="preserve">“Disposition” means the sale, exchange, redemption, maturity, or other disposition by the Fund of all or a portion of a Portfolio Investment, including distributions in kind to the Partners.  For all purposes of this Agreement, an extraordinary dividend, refinancing, capital restructuring or similar transaction or distribution in connection with a Portfolio Investment shall be considered a “Disposition”.</w:t>
         </w:r>
@@ -2185,12 +2185,12 @@
       <w:r>
         <w:t>“Distributable Proceeds” means, as of any date, the excess of (i) the cash received by the Fund from any</w:t>
       </w:r>
-      <w:del w:id="45" w:author="AtomizerTest" w:date="2026-02-21T18:24:09Z">
+      <w:del w:id="45" w:author="AtomizerTest" w:date="2026-02-22T03:05:13Z">
         <w:r>
           <w:delText xml:space="preserve"> sale or other disposition</w:delText>
         </w:r>
       </w:del>
-      <w:ins w:id="46" w:author="AtomizerTest" w:date="2026-02-21T18:24:09Z">
+      <w:ins w:id="46" w:author="AtomizerTest" w:date="2026-02-22T03:05:13Z">
         <w:r>
           <w:t xml:space="preserve"> Disposition</w:t>
         </w:r>
@@ -2293,7 +2293,7 @@
       <w:r>
         <w:t xml:space="preserve">“Escrow Account” has the meaning set forth in Section </w:t>
       </w:r>
-      <w:del w:id="47" w:author="AtomizerTest" w:date="2026-02-21T18:24:09Z">
+      <w:del w:id="47" w:author="AtomizerTest" w:date="2026-02-22T03:05:13Z">
         <w:r>
           <w:fldChar w:fldCharType="begin"/>
           <w:instrText xml:space="preserve"> REF _Ref18675847 \r \h </w:instrText>
@@ -2302,7 +2302,7 @@
           <w:fldChar w:fldCharType="end"/>
         </w:r>
       </w:del>
-      <w:ins w:id="48" w:author="AtomizerTest" w:date="2026-02-21T18:24:09Z">
+      <w:ins w:id="48" w:author="AtomizerTest" w:date="2026-02-22T03:05:13Z">
         <w:r>
           <w:fldChar w:fldCharType="begin"/>
           <w:instrText xml:space="preserve"> REF _Ref34603774 \r \h </w:instrText>
@@ -2758,10 +2758,10 @@
       <w:pPr>
         <w:pStyle w:val="BodyText"/>
         <w:rPr>
-          <w:ins w:id="49" w:author="AtomizerTest" w:date="2026-02-21T18:24:09Z"/>
-        </w:rPr>
-      </w:pPr>
-      <w:ins w:id="50" w:author="AtomizerTest" w:date="2026-02-21T18:24:09Z">
+          <w:ins w:id="49" w:author="AtomizerTest" w:date="2026-02-22T03:05:13Z"/>
+        </w:rPr>
+      </w:pPr>
+      <w:ins w:id="50" w:author="AtomizerTest" w:date="2026-02-22T03:05:13Z">
         <w:r>
           <w:t xml:space="preserve">“Interim Clawback Amount” has the meaning set forth in Section </w:t>
           <w:fldChar w:fldCharType="begin"/>
@@ -2777,10 +2777,10 @@
       <w:pPr>
         <w:pStyle w:val="BodyText"/>
         <w:rPr>
-          <w:ins w:id="51" w:author="AtomizerTest" w:date="2026-02-21T18:24:09Z"/>
-        </w:rPr>
-      </w:pPr>
-      <w:ins w:id="52" w:author="AtomizerTest" w:date="2026-02-21T18:24:09Z">
+          <w:ins w:id="51" w:author="AtomizerTest" w:date="2026-02-22T03:05:13Z"/>
+        </w:rPr>
+      </w:pPr>
+      <w:ins w:id="52" w:author="AtomizerTest" w:date="2026-02-22T03:05:13Z">
         <w:r>
           <w:t xml:space="preserve">“Interim Clawback Date” has the meaning set forth in Section </w:t>
           <w:fldChar w:fldCharType="begin"/>
@@ -2796,10 +2796,10 @@
       <w:pPr>
         <w:pStyle w:val="BodyText"/>
         <w:rPr>
-          <w:ins w:id="53" w:author="AtomizerTest" w:date="2026-02-21T18:24:09Z"/>
-        </w:rPr>
-      </w:pPr>
-      <w:ins w:id="54" w:author="AtomizerTest" w:date="2026-02-21T18:24:09Z">
+          <w:ins w:id="53" w:author="AtomizerTest" w:date="2026-02-22T03:05:13Z"/>
+        </w:rPr>
+      </w:pPr>
+      <w:ins w:id="54" w:author="AtomizerTest" w:date="2026-02-22T03:05:13Z">
         <w:r>
           <w:t xml:space="preserve">“Interim Clawback Obligation” has the meaning set forth in Section </w:t>
           <w:fldChar w:fldCharType="begin"/>
@@ -3048,12 +3048,12 @@
       <w:r>
         <w:t>“Non-Defaulting Partners” has the meaning set forth in Section </w:t>
       </w:r>
-      <w:del w:id="55" w:author="AtomizerTest" w:date="2026-02-21T18:24:09Z">
+      <w:del w:id="55" w:author="AtomizerTest" w:date="2026-02-22T03:05:13Z">
         <w:r>
           <w:delText>6.6.3.</w:delText>
         </w:r>
       </w:del>
-      <w:ins w:id="56" w:author="AtomizerTest" w:date="2026-02-21T18:24:09Z">
+      <w:ins w:id="56" w:author="AtomizerTest" w:date="2026-02-22T03:05:13Z">
         <w:r>
           <w:fldChar w:fldCharType="begin"/>
           <w:instrText xml:space="preserve"> REF _Ref18679391 \r \h </w:instrText>
@@ -3250,12 +3250,12 @@
       <w:r>
         <w:t xml:space="preserve">“Preferred Return” means, with respect to each Partner (other than an Affiliated Partner), as of any date of determination, such amount as is equal to an annual rate of return of [8]%, compounded annually and calculated daily on the Capital Contributions made by such Limited </w:t>
       </w:r>
-      <w:del w:id="57" w:author="AtomizerTest" w:date="2026-02-21T18:24:09Z">
+      <w:del w:id="57" w:author="AtomizerTest" w:date="2026-02-22T03:05:13Z">
         <w:r>
           <w:delText>Partner,</w:delText>
         </w:r>
       </w:del>
-      <w:ins w:id="58" w:author="AtomizerTest" w:date="2026-02-21T18:24:09Z">
+      <w:ins w:id="58" w:author="AtomizerTest" w:date="2026-02-22T03:05:13Z">
         <w:r>
           <w:t xml:space="preserve">Partner described in Section </w:t>
           <w:fldChar w:fldCharType="begin"/>
@@ -3325,10 +3325,10 @@
       <w:pPr>
         <w:pStyle w:val="BodyText"/>
         <w:rPr>
-          <w:ins w:id="59" w:author="AtomizerTest" w:date="2026-02-21T18:24:09Z"/>
-        </w:rPr>
-      </w:pPr>
-      <w:ins w:id="60" w:author="AtomizerTest" w:date="2026-02-21T18:24:09Z">
+          <w:ins w:id="59" w:author="AtomizerTest" w:date="2026-02-22T03:05:13Z"/>
+        </w:rPr>
+      </w:pPr>
+      <w:ins w:id="60" w:author="AtomizerTest" w:date="2026-02-22T03:05:13Z">
         <w:r>
           <w:t>“Realized Investment” means, as of any date of determination, each Portfolio Investment (other than Temporary Investments) that has been the subject of a Disposition.</w:t>
         </w:r>
@@ -3817,10 +3817,10 @@
       <w:pPr>
         <w:pStyle w:val="BodyText"/>
         <w:rPr>
-          <w:ins w:id="61" w:author="AtomizerTest" w:date="2026-02-21T18:24:09Z"/>
-        </w:rPr>
-      </w:pPr>
-      <w:ins w:id="62" w:author="AtomizerTest" w:date="2026-02-21T18:24:09Z">
+          <w:ins w:id="61" w:author="AtomizerTest" w:date="2026-02-22T03:05:13Z"/>
+        </w:rPr>
+      </w:pPr>
+      <w:ins w:id="62" w:author="AtomizerTest" w:date="2026-02-22T03:05:13Z">
         <w:r>
           <w:t>“Unrealized Investment” means each Portfolio Investment other than Temporary Investments and Realized Investments.</w:t>
         </w:r>
@@ -3830,10 +3830,10 @@
       <w:pPr>
         <w:pStyle w:val="BodyText"/>
         <w:rPr>
-          <w:ins w:id="63" w:author="AtomizerTest" w:date="2026-02-21T18:24:09Z"/>
-        </w:rPr>
-      </w:pPr>
-      <w:ins w:id="64" w:author="AtomizerTest" w:date="2026-02-21T18:24:09Z">
+          <w:ins w:id="63" w:author="AtomizerTest" w:date="2026-02-22T03:05:13Z"/>
+        </w:rPr>
+      </w:pPr>
+      <w:ins w:id="64" w:author="AtomizerTest" w:date="2026-02-22T03:05:13Z">
         <w:r>
           <w:t>“Unrealized Loss” shall mean, with respect to each Partner and each Unrealized Investment, as of any date of determination, the excess, if any, of (i) the Capital Contributions of such Partner used to fund the cost of such Unrealized Investment (including any expenses incurred in making or maintaining such Portfolio Investment) over (ii) the product of (A) the Value of such Unrealized Investment as of such date of determination and (B) such Partner’s Sharing Percentage for such Unrealized Investment.</w:t>
         </w:r>
@@ -3846,7 +3846,7 @@
           <w:b/>
         </w:rPr>
       </w:pPr>
-      <w:ins w:id="65" w:author="AtomizerTest" w:date="2026-02-21T18:24:09Z">
+      <w:ins w:id="65" w:author="AtomizerTest" w:date="2026-02-22T03:05:13Z">
         <w:r>
           <w:t xml:space="preserve"> </w:t>
         </w:r>
@@ -4134,12 +4134,12 @@
         <w:tab/>
         <w:t xml:space="preserve">engage in such other activities as are necessary, advisable, lawful and consistent with the foregoing, (the “Investment Objectives”), in all cases in accordance with the Investment Policy, </w:t>
       </w:r>
-      <w:del w:id="66" w:author="AtomizerTest" w:date="2026-02-21T18:24:09Z">
+      <w:del w:id="66" w:author="AtomizerTest" w:date="2026-02-22T03:05:13Z">
         <w:r>
           <w:delText>Section </w:delText>
         </w:r>
       </w:del>
-      <w:ins w:id="67" w:author="AtomizerTest" w:date="2026-02-21T18:24:09Z">
+      <w:ins w:id="67" w:author="AtomizerTest" w:date="2026-02-22T03:05:13Z">
         <w:r>
           <w:t>Section </w:t>
         </w:r>
@@ -4658,7 +4658,7 @@
       </w:r>
       <w:r>
         <w:rPr>
-          <w:rPrChange w:id="68" w:author="AtomizerTest" w:date="2026-02-21T18:24:09Z">
+          <w:rPrChange w:id="68" w:author="AtomizerTest" w:date="2026-02-22T03:05:13Z">
             <w:u w:color="0000FF"/>
           </w:rPrChange>
         </w:rPr>
@@ -4696,7 +4696,7 @@
         <w:t>Section</w:t>
         <w:t xml:space="preserve"> </w:t>
       </w:r>
-      <w:del w:id="69" w:author="AtomizerTest" w:date="2026-02-21T18:24:09Z">
+      <w:del w:id="69" w:author="AtomizerTest" w:date="2026-02-22T03:05:13Z">
         <w:r>
           <w:rPr>
             <w:u w:color="0000FF"/>
@@ -4704,7 +4704,7 @@
           <w:delText>14.7.3,</w:delText>
         </w:r>
       </w:del>
-      <w:ins w:id="70" w:author="AtomizerTest" w:date="2026-02-21T18:24:09Z">
+      <w:ins w:id="70" w:author="AtomizerTest" w:date="2026-02-22T03:05:13Z">
         <w:r>
           <w:fldChar w:fldCharType="begin"/>
           <w:instrText xml:space="preserve"> REF _Ref40095493 \r \h </w:instrText>
@@ -6404,7 +6404,7 @@
           <w:tab w:val="left" w:pos="2520"/>
         </w:tabs>
       </w:pPr>
-      <w:del w:id="71" w:author="AtomizerTest" w:date="2026-02-21T18:24:09Z">
+      <w:del w:id="71" w:author="AtomizerTest" w:date="2026-02-22T03:05:13Z">
         <w:r>
           <w:tab/>
         </w:r>
@@ -6920,7 +6920,7 @@
         <w:fldChar w:fldCharType="end"/>
         <w:t xml:space="preserve"> (Key Person Event; Suspension), [__]% per annum of the Capital Contributions made by such Limited Partner to fund the Acquisition Cost of Portfolio Investments other than Temporary Investments, less an amount equal to the Acquisition Cost of Portfolio Investments, other than Temporary Investments, that have been realized (in whole or in part), written off or Permanently Written Down as of the end of the most recent financial quarter.</w:t>
       </w:r>
-      <w:del w:id="72" w:author="AtomizerTest" w:date="2026-02-21T18:24:09Z">
+      <w:del w:id="72" w:author="AtomizerTest" w:date="2026-02-22T03:05:13Z">
         <w:r>
           <w:delText xml:space="preserve"> </w:delText>
         </w:r>
@@ -7703,7 +7703,7 @@
         <w:fldChar w:fldCharType="end"/>
         <w:t xml:space="preserve"> (Distributions; Allocations)) shall immediately and automatically terminate, no further distributions of Carried Interest shall be made to the removed General Partner, and any amounts retained in the Escrow Account pursuant to Section </w:t>
       </w:r>
-      <w:del w:id="73" w:author="AtomizerTest" w:date="2026-02-21T18:24:09Z">
+      <w:del w:id="73" w:author="AtomizerTest" w:date="2026-02-22T03:05:13Z">
         <w:r>
           <w:fldChar w:fldCharType="begin"/>
           <w:instrText xml:space="preserve"> REF _Ref18675847 \r \h </w:instrText>
@@ -7712,7 +7712,7 @@
           <w:fldChar w:fldCharType="end"/>
         </w:r>
       </w:del>
-      <w:ins w:id="74" w:author="AtomizerTest" w:date="2026-02-21T18:24:09Z">
+      <w:ins w:id="74" w:author="AtomizerTest" w:date="2026-02-22T03:05:13Z">
         <w:r>
           <w:fldChar w:fldCharType="begin"/>
           <w:instrText xml:space="preserve"> REF _Ref34603774 \r \h </w:instrText>
@@ -8078,7 +8078,7 @@
         <w:fldChar w:fldCharType="end"/>
         <w:t xml:space="preserve"> (Winding Up); provided that with respect to a termination of the Fund on delivery of a Removal for Cause Notice, the right of the General Partner to receive further distributions of Carried Interest from the Fund shall immediately and automatically terminate, no further distributions of Carried Interest shall be made to the General Partner, and any amounts retained in the Escrow Account pursuant to Section</w:t>
       </w:r>
-      <w:del w:id="75" w:author="AtomizerTest" w:date="2026-02-21T18:24:09Z">
+      <w:del w:id="75" w:author="AtomizerTest" w:date="2026-02-22T03:05:13Z">
         <w:r>
           <w:delText xml:space="preserve"> </w:delText>
           <w:fldChar w:fldCharType="begin"/>
@@ -8088,7 +8088,7 @@
           <w:fldChar w:fldCharType="end"/>
         </w:r>
       </w:del>
-      <w:ins w:id="76" w:author="AtomizerTest" w:date="2026-02-21T18:24:09Z">
+      <w:ins w:id="76" w:author="AtomizerTest" w:date="2026-02-22T03:05:13Z">
         <w:r>
           <w:t> </w:t>
           <w:fldChar w:fldCharType="begin"/>
@@ -9031,12 +9031,12 @@
         <w:fldChar w:fldCharType="end"/>
         <w:t xml:space="preserve"> equal to </w:t>
       </w:r>
-      <w:del w:id="77" w:author="AtomizerTest" w:date="2026-02-21T18:24:09Z">
+      <w:del w:id="77" w:author="AtomizerTest" w:date="2026-02-22T03:05:13Z">
         <w:r>
           <w:delText>such Partner’s aggregate Capital Contributions;</w:delText>
         </w:r>
       </w:del>
-      <w:ins w:id="78" w:author="AtomizerTest" w:date="2026-02-21T18:24:09Z">
+      <w:ins w:id="78" w:author="AtomizerTest" w:date="2026-02-22T03:05:13Z">
         <w:r>
           <w:t>the sum of (without duplication):</w:t>
         </w:r>
@@ -9050,10 +9050,10 @@
         </w:tabs>
         <w:ind w:left="720" w:firstLine="720"/>
         <w:rPr>
-          <w:ins w:id="79" w:author="AtomizerTest" w:date="2026-02-21T18:24:09Z"/>
-        </w:rPr>
-      </w:pPr>
-      <w:ins w:id="80" w:author="AtomizerTest" w:date="2026-02-21T18:24:09Z">
+          <w:ins w:id="79" w:author="AtomizerTest" w:date="2026-02-22T03:05:13Z"/>
+        </w:rPr>
+      </w:pPr>
+      <w:ins w:id="80" w:author="AtomizerTest" w:date="2026-02-22T03:05:13Z">
         <w:r>
           <w:tab/>
           <w:t>the Capital Contributions of such Partner used to fund the cost of (i) such Portfolio Investment, (ii) each Realized Investment, and (iii) aggregate Unrealized Losses; and</w:t>
@@ -9068,10 +9068,10 @@
         </w:tabs>
         <w:ind w:left="720" w:firstLine="720"/>
         <w:rPr>
-          <w:ins w:id="81" w:author="AtomizerTest" w:date="2026-02-21T18:24:09Z"/>
-        </w:rPr>
-      </w:pPr>
-      <w:ins w:id="82" w:author="AtomizerTest" w:date="2026-02-21T18:24:09Z">
+          <w:ins w:id="81" w:author="AtomizerTest" w:date="2026-02-22T03:05:13Z"/>
+        </w:rPr>
+      </w:pPr>
+      <w:ins w:id="82" w:author="AtomizerTest" w:date="2026-02-22T03:05:13Z">
         <w:r>
           <w:tab/>
           <w:t>the Capital Contributions of such Partner used to fund Fund Expenses including the Management Fee;</w:t>
@@ -9115,7 +9115,7 @@
         <w:tab/>
         <w:t>Third,</w:t>
       </w:r>
-      <w:ins w:id="83" w:author="AtomizerTest" w:date="2026-02-21T18:24:09Z">
+      <w:ins w:id="83" w:author="AtomizerTest" w:date="2026-02-22T03:05:13Z">
         <w:r>
           <w:t xml:space="preserve"> either (i)</w:t>
         </w:r>
@@ -9123,12 +9123,12 @@
       <w:r>
         <w:t xml:space="preserve"> [80]% to the General Partner and [20]% to such Partner </w:t>
       </w:r>
-      <w:del w:id="84" w:author="AtomizerTest" w:date="2026-02-21T18:24:09Z">
+      <w:del w:id="84" w:author="AtomizerTest" w:date="2026-02-22T03:05:13Z">
         <w:r>
           <w:delText>until the General Partner has received</w:delText>
         </w:r>
       </w:del>
-      <w:ins w:id="85" w:author="AtomizerTest" w:date="2026-02-21T18:24:09Z">
+      <w:ins w:id="85" w:author="AtomizerTest" w:date="2026-02-22T03:05:13Z">
         <w:r>
           <w:t>or (ii) 100% to such Partner, as appropriate, until the</w:t>
         </w:r>
@@ -9136,7 +9136,7 @@
       <w:r>
         <w:t xml:space="preserve"> cumulative distributions</w:t>
       </w:r>
-      <w:ins w:id="86" w:author="AtomizerTest" w:date="2026-02-21T18:24:09Z">
+      <w:ins w:id="86" w:author="AtomizerTest" w:date="2026-02-22T03:05:13Z">
         <w:r>
           <w:t xml:space="preserve"> received by the General Partner</w:t>
         </w:r>
@@ -9144,7 +9144,7 @@
       <w:r>
         <w:t xml:space="preserve"> with respect to such Partner pursuant to</w:t>
       </w:r>
-      <w:del w:id="87" w:author="AtomizerTest" w:date="2026-02-21T18:24:09Z">
+      <w:del w:id="87" w:author="AtomizerTest" w:date="2026-02-22T03:05:13Z">
         <w:r>
           <w:delText xml:space="preserve"> this</w:delText>
         </w:r>
@@ -9152,7 +9152,7 @@
       <w:r>
         <w:t xml:space="preserve"> Section </w:t>
       </w:r>
-      <w:del w:id="88" w:author="AtomizerTest" w:date="2026-02-21T18:24:09Z">
+      <w:del w:id="88" w:author="AtomizerTest" w:date="2026-02-22T03:05:13Z">
         <w:r>
           <w:fldChar w:fldCharType="begin"/>
           <w:instrText xml:space="preserve"> REF _Ref437891131 \r \h </w:instrText>
@@ -9161,7 +9161,7 @@
           <w:fldChar w:fldCharType="end"/>
         </w:r>
       </w:del>
-      <w:ins w:id="89" w:author="AtomizerTest" w:date="2026-02-21T18:24:09Z">
+      <w:ins w:id="89" w:author="AtomizerTest" w:date="2026-02-22T03:05:13Z">
         <w:r>
           <w:fldChar w:fldCharType="begin"/>
           <w:instrText xml:space="preserve"> REF _Ref18679183 \r \h </w:instrText>
@@ -9173,7 +9173,7 @@
       <w:r>
         <w:t xml:space="preserve"> equal to [20]%</w:t>
       </w:r>
-      <w:ins w:id="90" w:author="AtomizerTest" w:date="2026-02-21T18:24:09Z">
+      <w:ins w:id="90" w:author="AtomizerTest" w:date="2026-02-22T03:05:13Z">
         <w:r>
           <w:t xml:space="preserve"> of the excess</w:t>
         </w:r>
@@ -9181,7 +9181,7 @@
       <w:r>
         <w:t xml:space="preserve"> of</w:t>
       </w:r>
-      <w:ins w:id="91" w:author="AtomizerTest" w:date="2026-02-21T18:24:09Z">
+      <w:ins w:id="91" w:author="AtomizerTest" w:date="2026-02-22T03:05:13Z">
         <w:r>
           <w:t xml:space="preserve"> (x)</w:t>
         </w:r>
@@ -9189,7 +9189,7 @@
       <w:r>
         <w:t xml:space="preserve"> the cumulative amount of distributions made or being made to</w:t>
       </w:r>
-      <w:del w:id="92" w:author="AtomizerTest" w:date="2026-02-21T18:24:09Z">
+      <w:del w:id="92" w:author="AtomizerTest" w:date="2026-02-22T03:05:13Z">
         <w:r>
           <w:delText xml:space="preserve"> (i)</w:delText>
         </w:r>
@@ -9197,7 +9197,7 @@
       <w:r>
         <w:t xml:space="preserve"> such Partner</w:t>
       </w:r>
-      <w:del w:id="93" w:author="AtomizerTest" w:date="2026-02-21T18:24:09Z">
+      <w:del w:id="93" w:author="AtomizerTest" w:date="2026-02-22T03:05:13Z">
         <w:r>
           <w:delText xml:space="preserve"> pursuant to Section </w:delText>
           <w:fldChar w:fldCharType="begin"/>
@@ -9217,12 +9217,12 @@
       <w:r>
         <w:t xml:space="preserve"> and </w:t>
       </w:r>
-      <w:del w:id="94" w:author="AtomizerTest" w:date="2026-02-21T18:24:09Z">
+      <w:del w:id="94" w:author="AtomizerTest" w:date="2026-02-22T03:05:13Z">
         <w:r>
           <w:delText>(ii)</w:delText>
         </w:r>
       </w:del>
-      <w:ins w:id="95" w:author="AtomizerTest" w:date="2026-02-21T18:24:09Z">
+      <w:ins w:id="95" w:author="AtomizerTest" w:date="2026-02-22T03:05:13Z">
         <w:r>
           <w:t>to</w:t>
         </w:r>
@@ -9230,7 +9230,7 @@
       <w:r>
         <w:t xml:space="preserve"> the General Partner with respect to such Partner pursuant to</w:t>
       </w:r>
-      <w:del w:id="96" w:author="AtomizerTest" w:date="2026-02-21T18:24:09Z">
+      <w:del w:id="96" w:author="AtomizerTest" w:date="2026-02-22T03:05:13Z">
         <w:r>
           <w:delText xml:space="preserve"> this</w:delText>
         </w:r>
@@ -9238,7 +9238,7 @@
       <w:r>
         <w:t xml:space="preserve"> Section </w:t>
       </w:r>
-      <w:del w:id="97" w:author="AtomizerTest" w:date="2026-02-21T18:24:09Z">
+      <w:del w:id="97" w:author="AtomizerTest" w:date="2026-02-22T03:05:13Z">
         <w:r>
           <w:fldChar w:fldCharType="begin"/>
           <w:instrText xml:space="preserve"> REF _Ref437891131 \r \h </w:instrText>
@@ -9247,7 +9247,7 @@
           <w:fldChar w:fldCharType="end"/>
         </w:r>
       </w:del>
-      <w:ins w:id="98" w:author="AtomizerTest" w:date="2026-02-21T18:24:09Z">
+      <w:ins w:id="98" w:author="AtomizerTest" w:date="2026-02-22T03:05:13Z">
         <w:r>
           <w:fldChar w:fldCharType="begin"/>
           <w:instrText xml:space="preserve"> REF _Ref18679183 \r \h </w:instrText>
@@ -9493,12 +9493,12 @@
         <w:tab/>
         <w:t xml:space="preserve">For purposes of this Section </w:t>
       </w:r>
-      <w:del w:id="99" w:author="AtomizerTest" w:date="2026-02-21T18:24:09Z">
+      <w:del w:id="99" w:author="AtomizerTest" w:date="2026-02-22T03:05:13Z">
         <w:r>
           <w:delText>14.6,</w:delText>
         </w:r>
       </w:del>
-      <w:ins w:id="100" w:author="AtomizerTest" w:date="2026-02-21T18:24:09Z">
+      <w:ins w:id="100" w:author="AtomizerTest" w:date="2026-02-22T03:05:13Z">
         <w:r>
           <w:fldChar w:fldCharType="begin"/>
           <w:instrText xml:space="preserve"> REF _Ref18682218 \r \h </w:instrText>
@@ -9550,7 +9550,7 @@
         <w:tab/>
         <w:t>If, upon</w:t>
       </w:r>
-      <w:del w:id="101" w:author="AtomizerTest" w:date="2026-02-21T18:24:09Z">
+      <w:del w:id="101" w:author="AtomizerTest" w:date="2026-02-22T03:05:13Z">
         <w:r>
           <w:delText xml:space="preserve"> any of</w:delText>
         </w:r>
@@ -9558,7 +9558,7 @@
       <w:r>
         <w:t xml:space="preserve"> (i)</w:t>
       </w:r>
-      <w:del w:id="102" w:author="AtomizerTest" w:date="2026-02-21T18:24:09Z">
+      <w:del w:id="102" w:author="AtomizerTest" w:date="2026-02-22T03:05:13Z">
         <w:r>
           <w:delText xml:space="preserve"> the first anniversary following the end of the Commitment Period, (ii) a Removal Date, (iii)</w:delText>
         </w:r>
@@ -9571,7 +9571,7 @@
         <w:t>18.3.2.2</w:t>
         <w:fldChar w:fldCharType="end"/>
       </w:r>
-      <w:del w:id="103" w:author="AtomizerTest" w:date="2026-02-21T18:24:09Z">
+      <w:del w:id="103" w:author="AtomizerTest" w:date="2026-02-22T03:05:13Z">
         <w:r>
           <w:delText>;</w:delText>
         </w:r>
@@ -9579,12 +9579,12 @@
       <w:r>
         <w:t xml:space="preserve"> or </w:t>
       </w:r>
-      <w:del w:id="104" w:author="AtomizerTest" w:date="2026-02-21T18:24:09Z">
+      <w:del w:id="104" w:author="AtomizerTest" w:date="2026-02-22T03:05:13Z">
         <w:r>
           <w:delText>(iv)</w:delText>
         </w:r>
       </w:del>
-      <w:ins w:id="105" w:author="AtomizerTest" w:date="2026-02-21T18:24:09Z">
+      <w:ins w:id="105" w:author="AtomizerTest" w:date="2026-02-22T03:05:13Z">
         <w:r>
           <w:t>(ii)</w:t>
         </w:r>
@@ -9598,7 +9598,7 @@
         <w:fldChar w:fldCharType="end"/>
         <w:t xml:space="preserve"> (Limited Partner </w:t>
       </w:r>
-      <w:del w:id="106" w:author="AtomizerTest" w:date="2026-02-21T18:24:09Z">
+      <w:del w:id="106" w:author="AtomizerTest" w:date="2026-02-22T03:05:13Z">
         <w:r>
           <w:rPr>
             <w:i/>
@@ -9606,7 +9606,7 @@
           <w:delText>Giveback),</w:delText>
         </w:r>
       </w:del>
-      <w:ins w:id="107" w:author="AtomizerTest" w:date="2026-02-21T18:24:09Z">
+      <w:ins w:id="107" w:author="AtomizerTest" w:date="2026-02-22T03:05:13Z">
         <w:r>
           <w:rPr>
             <w:i/>
@@ -9663,12 +9663,12 @@
         <w:fldChar w:fldCharType="end"/>
         <w:t xml:space="preserve"> (Winding Up) attributable to such Limited Partner that exceed the amount of distributions of Carried Interest that the General Partner should have received, taking into account in the aggregate all Capital Contributions, all distributions by the Fund pursuant to Section</w:t>
       </w:r>
-      <w:del w:id="108" w:author="AtomizerTest" w:date="2026-02-21T18:24:09Z">
+      <w:del w:id="108" w:author="AtomizerTest" w:date="2026-02-22T03:05:13Z">
         <w:r>
           <w:delText xml:space="preserve"> </w:delText>
         </w:r>
       </w:del>
-      <w:ins w:id="109" w:author="AtomizerTest" w:date="2026-02-21T18:24:09Z">
+      <w:ins w:id="109" w:author="AtomizerTest" w:date="2026-02-22T03:05:13Z">
         <w:r>
           <w:t> </w:t>
         </w:r>
@@ -9700,12 +9700,12 @@
         <w:fldChar w:fldCharType="end"/>
         <w:t xml:space="preserve"> (Limited Partner Giveback) attributable to such Limited</w:t>
       </w:r>
-      <w:del w:id="110" w:author="AtomizerTest" w:date="2026-02-21T18:24:09Z">
+      <w:del w:id="110" w:author="AtomizerTest" w:date="2026-02-22T03:05:13Z">
         <w:r>
           <w:delText xml:space="preserve"> Partner at such time;</w:delText>
         </w:r>
       </w:del>
-      <w:ins w:id="111" w:author="AtomizerTest" w:date="2026-02-21T18:24:09Z">
+      <w:ins w:id="111" w:author="AtomizerTest" w:date="2026-02-22T03:05:13Z">
         <w:r>
           <w:t xml:space="preserve"> Partner;</w:t>
         </w:r>
@@ -9862,10 +9862,10 @@
         </w:tabs>
         <w:ind w:left="0" w:firstLine="720"/>
         <w:rPr>
-          <w:ins w:id="112" w:author="AtomizerTest" w:date="2026-02-21T18:24:09Z"/>
-        </w:rPr>
-      </w:pPr>
-      <w:ins w:id="113" w:author="AtomizerTest" w:date="2026-02-21T18:24:09Z">
+          <w:ins w:id="112" w:author="AtomizerTest" w:date="2026-02-22T03:05:13Z"/>
+        </w:rPr>
+      </w:pPr>
+      <w:ins w:id="113" w:author="AtomizerTest" w:date="2026-02-22T03:05:13Z">
         <w:r>
           <w:tab/>
           <w:t>If, upon any of (i) the first anniversary following the end of the Commitment Period and [every year] thereafter, (ii) a Removal Date, or (iii) any re-advance of any amounts pursuant to Section </w:t>
@@ -9985,7 +9985,7 @@
       <w:r>
         <w:rPr>
           <w:highlight w:val="yellow"/>
-          <w:rPrChange w:id="114" w:author="AtomizerTest" w:date="2026-02-21T18:24:09Z">
+          <w:rPrChange w:id="114" w:author="AtomizerTest" w:date="2026-02-22T03:05:13Z">
             <w:b/>
             <w:highlight w:val="yellow"/>
           </w:rPrChange>
@@ -10015,7 +10015,7 @@
         <w:fldChar w:fldCharType="end"/>
         <w:t>, which amount shall be distributed to the relevant Partner in accordance with the provisions thereof.]</w:t>
       </w:r>
-      <w:ins w:id="115" w:author="AtomizerTest" w:date="2026-02-21T18:24:09Z">
+      <w:ins w:id="115" w:author="AtomizerTest" w:date="2026-02-22T03:05:13Z">
         <w:r>
           <w:t xml:space="preserve"> </w:t>
         </w:r>
@@ -10034,7 +10034,7 @@
       </w:r>
       <w:r>
         <w:rPr>
-          <w:rPrChange w:id="116" w:author="AtomizerTest" w:date="2026-02-21T18:24:09Z">
+          <w:rPrChange w:id="116" w:author="AtomizerTest" w:date="2026-02-22T03:05:13Z">
             <w:u w:color="0000FF"/>
           </w:rPrChange>
         </w:rPr>
@@ -10075,7 +10075,7 @@
         <w:t>Section</w:t>
         <w:t xml:space="preserve"> </w:t>
       </w:r>
-      <w:del w:id="117" w:author="AtomizerTest" w:date="2026-02-21T18:24:09Z">
+      <w:del w:id="117" w:author="AtomizerTest" w:date="2026-02-22T03:05:13Z">
         <w:r>
           <w:rPr>
             <w:u w:color="0000FF"/>
@@ -10087,7 +10087,7 @@
           <w:fldChar w:fldCharType="end"/>
         </w:r>
       </w:del>
-      <w:ins w:id="118" w:author="AtomizerTest" w:date="2026-02-21T18:24:09Z">
+      <w:ins w:id="118" w:author="AtomizerTest" w:date="2026-02-22T03:05:13Z">
         <w:r>
           <w:fldChar w:fldCharType="begin"/>
           <w:instrText xml:space="preserve"> REF _Ref40095031 \r \h </w:instrText>
@@ -10098,7 +10098,7 @@
       </w:ins>
       <w:r>
         <w:rPr>
-          <w:rPrChange w:id="119" w:author="AtomizerTest" w:date="2026-02-21T18:24:09Z">
+          <w:rPrChange w:id="119" w:author="AtomizerTest" w:date="2026-02-22T03:05:13Z">
             <w:u w:color="0000FF"/>
           </w:rPrChange>
         </w:rPr>
@@ -10224,7 +10224,7 @@
         <w:t xml:space="preserve"> </w:t>
         <w:t>14.7.1</w:t>
       </w:r>
-      <w:ins w:id="120" w:author="AtomizerTest" w:date="2026-02-21T18:24:09Z">
+      <w:ins w:id="120" w:author="AtomizerTest" w:date="2026-02-22T03:05:13Z">
         <w:r>
           <w:t xml:space="preserve"> or Section </w:t>
           <w:fldChar w:fldCharType="begin"/>
@@ -10236,7 +10236,7 @@
       </w:ins>
       <w:r>
         <w:rPr>
-          <w:rPrChange w:id="121" w:author="AtomizerTest" w:date="2026-02-21T18:24:09Z">
+          <w:rPrChange w:id="121" w:author="AtomizerTest" w:date="2026-02-22T03:05:13Z">
             <w:u w:color="0000FF"/>
           </w:rPrChange>
         </w:rPr>
@@ -10244,7 +10244,7 @@
         <w:t xml:space="preserve"> </w:t>
         <w:t>such</w:t>
       </w:r>
-      <w:del w:id="122" w:author="AtomizerTest" w:date="2026-02-21T18:24:09Z">
+      <w:del w:id="122" w:author="AtomizerTest" w:date="2026-02-22T03:05:13Z">
         <w:r>
           <w:rPr>
             <w:u w:color="0000FF"/>
@@ -10252,14 +10252,14 @@
           <w:delText xml:space="preserve"> </w:delText>
         </w:r>
       </w:del>
-      <w:ins w:id="123" w:author="AtomizerTest" w:date="2026-02-21T18:24:09Z">
+      <w:ins w:id="123" w:author="AtomizerTest" w:date="2026-02-22T03:05:13Z">
         <w:r>
           <w:t xml:space="preserve">  </w:t>
         </w:r>
       </w:ins>
       <w:r>
         <w:rPr>
-          <w:rPrChange w:id="124" w:author="AtomizerTest" w:date="2026-02-21T18:24:09Z">
+          <w:rPrChange w:id="124" w:author="AtomizerTest" w:date="2026-02-22T03:05:13Z">
             <w:u w:color="0000FF"/>
           </w:rPrChange>
         </w:rPr>
@@ -10368,7 +10368,7 @@
         <w:t>its</w:t>
         <w:t xml:space="preserve"> </w:t>
       </w:r>
-      <w:del w:id="125" w:author="AtomizerTest" w:date="2026-02-21T18:24:09Z">
+      <w:del w:id="125" w:author="AtomizerTest" w:date="2026-02-22T03:05:13Z">
         <w:r>
           <w:rPr>
             <w:u w:color="0000FF"/>
@@ -10376,14 +10376,14 @@
           <w:delText>obligation</w:delText>
         </w:r>
       </w:del>
-      <w:ins w:id="126" w:author="AtomizerTest" w:date="2026-02-21T18:24:09Z">
+      <w:ins w:id="126" w:author="AtomizerTest" w:date="2026-02-22T03:05:13Z">
         <w:r>
           <w:t>obligations</w:t>
         </w:r>
       </w:ins>
       <w:r>
         <w:rPr>
-          <w:rPrChange w:id="127" w:author="AtomizerTest" w:date="2026-02-21T18:24:09Z">
+          <w:rPrChange w:id="127" w:author="AtomizerTest" w:date="2026-02-22T03:05:13Z">
             <w:u w:color="0000FF"/>
           </w:rPrChange>
         </w:rPr>
@@ -10394,7 +10394,7 @@
         <w:t xml:space="preserve"> </w:t>
         <w:t>14.7.1</w:t>
       </w:r>
-      <w:ins w:id="128" w:author="AtomizerTest" w:date="2026-02-21T18:24:09Z">
+      <w:ins w:id="128" w:author="AtomizerTest" w:date="2026-02-22T03:05:13Z">
         <w:r>
           <w:t xml:space="preserve"> or Section </w:t>
           <w:fldChar w:fldCharType="begin"/>
@@ -10406,7 +10406,7 @@
       </w:ins>
       <w:r>
         <w:rPr>
-          <w:rPrChange w:id="129" w:author="AtomizerTest" w:date="2026-02-21T18:24:09Z">
+          <w:rPrChange w:id="129" w:author="AtomizerTest" w:date="2026-02-22T03:05:13Z">
             <w:u w:color="0000FF"/>
           </w:rPrChange>
         </w:rPr>
@@ -10473,7 +10473,7 @@
         <w:t>Section</w:t>
         <w:t xml:space="preserve"> </w:t>
       </w:r>
-      <w:del w:id="130" w:author="AtomizerTest" w:date="2026-02-21T18:24:09Z">
+      <w:del w:id="130" w:author="AtomizerTest" w:date="2026-02-22T03:05:13Z">
         <w:r>
           <w:rPr>
             <w:u w:color="0000FF"/>
@@ -10485,7 +10485,7 @@
           <w:fldChar w:fldCharType="end"/>
         </w:r>
       </w:del>
-      <w:ins w:id="131" w:author="AtomizerTest" w:date="2026-02-21T18:24:09Z">
+      <w:ins w:id="131" w:author="AtomizerTest" w:date="2026-02-22T03:05:13Z">
         <w:r>
           <w:fldChar w:fldCharType="begin"/>
           <w:instrText xml:space="preserve"> REF _Ref40095031 \r \h </w:instrText>
@@ -10496,7 +10496,7 @@
       </w:ins>
       <w:r>
         <w:rPr>
-          <w:rPrChange w:id="132" w:author="AtomizerTest" w:date="2026-02-21T18:24:09Z">
+          <w:rPrChange w:id="132" w:author="AtomizerTest" w:date="2026-02-22T03:05:13Z">
             <w:u w:color="0000FF"/>
           </w:rPrChange>
         </w:rPr>
@@ -10523,7 +10523,7 @@
         <w:t xml:space="preserve"> </w:t>
         <w:t>14.7.1</w:t>
       </w:r>
-      <w:del w:id="133" w:author="AtomizerTest" w:date="2026-02-21T18:24:09Z">
+      <w:del w:id="133" w:author="AtomizerTest" w:date="2026-02-22T03:05:13Z">
         <w:r>
           <w:rPr>
             <w:u w:color="0000FF"/>
@@ -10531,7 +10531,7 @@
           <w:delText>.</w:delText>
         </w:r>
       </w:del>
-      <w:ins w:id="134" w:author="AtomizerTest" w:date="2026-02-21T18:24:09Z">
+      <w:ins w:id="134" w:author="AtomizerTest" w:date="2026-02-22T03:05:13Z">
         <w:r>
           <w:t xml:space="preserve"> or Section </w:t>
           <w:fldChar w:fldCharType="begin"/>
@@ -10545,7 +10545,7 @@
       <w:r>
         <w:rPr>
           <w:rStyle w:val="FootnoteReference"/>
-          <w:rPrChange w:id="135" w:author="AtomizerTest" w:date="2026-02-21T18:24:09Z">
+          <w:rPrChange w:id="135" w:author="AtomizerTest" w:date="2026-02-22T03:05:13Z">
             <w:rStyle w:val="FootnoteReference"/>
             <w:u w:color="0000FF"/>
           </w:rPrChange>
@@ -10561,12 +10561,12 @@
         </w:tabs>
         <w:ind w:left="0" w:firstLine="720"/>
       </w:pPr>
-      <w:del w:id="136" w:author="AtomizerTest" w:date="2026-02-21T18:24:09Z">
+      <w:del w:id="136" w:author="AtomizerTest" w:date="2026-02-22T03:05:13Z">
         <w:r>
           <w:tab/>
         </w:r>
       </w:del>
-      <w:ins w:id="137" w:author="AtomizerTest" w:date="2026-02-21T18:24:09Z">
+      <w:ins w:id="137" w:author="AtomizerTest" w:date="2026-02-22T03:05:13Z">
         <w:r>
           <w:tab/>
         </w:r>
@@ -10914,7 +10914,7 @@
         <w:fldChar w:fldCharType="end"/>
         <w:t xml:space="preserve"> (Right of Set Off) shall be without prejudice to any other rights or remedies available to the Fund under this Agreement or otherwise.</w:t>
       </w:r>
-      <w:del w:id="138" w:author="AtomizerTest" w:date="2026-02-21T18:24:09Z">
+      <w:del w:id="138" w:author="AtomizerTest" w:date="2026-02-22T03:05:13Z">
         <w:r>
           <w:delText xml:space="preserve">  </w:delText>
         </w:r>
@@ -10983,7 +10983,7 @@
         <w:tab/>
         <w:t>within ninety (90) days after the end of each Fiscal Year (commencing after December 31 of the Fiscal Year of the Initial Closing Date), a financial report audited by the Auditor as of the end of such Fiscal Year, prepared in compliance with GAAP, which shall include, among other things, (i) the audited financial statements of the Fund, (ii) confirmation that the amounts of Management Fee and Carried Interest that have been distributed, the amount of Carried Interest retained in the Escrow Account pursuant to Section </w:t>
       </w:r>
-      <w:del w:id="139" w:author="AtomizerTest" w:date="2026-02-21T18:24:09Z">
+      <w:del w:id="139" w:author="AtomizerTest" w:date="2026-02-22T03:05:13Z">
         <w:r>
           <w:fldChar w:fldCharType="begin"/>
           <w:instrText xml:space="preserve"> REF _Ref18675847 \r \h </w:instrText>
@@ -10992,7 +10992,7 @@
           <w:fldChar w:fldCharType="end"/>
         </w:r>
       </w:del>
-      <w:ins w:id="140" w:author="AtomizerTest" w:date="2026-02-21T18:24:09Z">
+      <w:ins w:id="140" w:author="AtomizerTest" w:date="2026-02-22T03:05:13Z">
         <w:r>
           <w:fldChar w:fldCharType="begin"/>
           <w:instrText xml:space="preserve"> REF _Ref40094595 \r \h </w:instrText>
@@ -11587,12 +11587,12 @@
         </w:tabs>
         <w:ind w:firstLine="0"/>
       </w:pPr>
-      <w:del w:id="141" w:author="AtomizerTest" w:date="2026-02-21T18:24:09Z">
+      <w:del w:id="141" w:author="AtomizerTest" w:date="2026-02-22T03:05:13Z">
         <w:r>
           <w:tab/>
         </w:r>
       </w:del>
-      <w:ins w:id="142" w:author="AtomizerTest" w:date="2026-02-21T18:24:09Z">
+      <w:ins w:id="142" w:author="AtomizerTest" w:date="2026-02-22T03:05:13Z">
         <w:r>
           <w:tab/>
         </w:r>
@@ -11615,7 +11615,7 @@
       <w:r>
         <w:tab/>
       </w:r>
-      <w:del w:id="143" w:author="AtomizerTest" w:date="2026-02-21T18:24:09Z">
+      <w:del w:id="143" w:author="AtomizerTest" w:date="2026-02-22T03:05:13Z">
         <w:r>
           <w:tab/>
         </w:r>
@@ -11633,13 +11633,13 @@
         </w:tabs>
         <w:ind w:left="0" w:firstLine="576"/>
       </w:pPr>
-      <w:del w:id="144" w:author="AtomizerTest" w:date="2026-02-21T18:24:09Z">
+      <w:del w:id="144" w:author="AtomizerTest" w:date="2026-02-22T03:05:13Z">
         <w:r>
           <w:tab/>
           <w:tab/>
         </w:r>
       </w:del>
-      <w:ins w:id="145" w:author="AtomizerTest" w:date="2026-02-21T18:24:09Z">
+      <w:ins w:id="145" w:author="AtomizerTest" w:date="2026-02-22T03:05:13Z">
         <w:r>
           <w:tab/>
         </w:r>
@@ -13581,7 +13581,7 @@
           <w:spacing w:val="-3"/>
           <w:szCs w:val="22"/>
           <w:lang w:eastAsia="en-GB"/>
-          <w:rPrChange w:id="146" w:author="AtomizerTest" w:date="2026-02-21T18:24:09Z">
+          <w:rPrChange w:id="146" w:author="AtomizerTest" w:date="2026-02-22T03:05:13Z">
             <w:rStyle w:val="FootnoteReference"/>
             <w:color w:val="000000"/>
             <w:szCs w:val="22"/>

</xml_diff>